<commit_message>
Add Pareto sensitivity, per-stage error analysis, latency data, and repo cleanup
- Add §4.5 threshold sensitivity with F5 Pareto figure (9 α values)
- Update Table 3: R2-stop error rates per agent (W8)
- Add latency benchmarks to §5: R1 3.2ms, R2 0.3ms (W6)
- Fix §3.3 to match actual code (constraint-based, not acc−α·rate)
- Add Wilson CI overlap and OOS trade-off to abstract
- Add reproducibility verification (dual-run ≤0.5pp variance)
- Split README into EN/ZH, remove internal dev notes from tracking
- Include rerun metrics (metrics_llm.json) and cascade analysis
</commit_message>
<xml_diff>
--- a/paper/Cost-Aware_Hybrid_Routing_Paper.docx
+++ b/paper/Cost-Aware_Hybrid_Routing_Paper.docx
@@ -108,7 +108,7 @@
           <w:sz w:val="22"/>
           <w:szCs w:val="22"/>
         </w:rPr>
-        <w:t xml:space="preserve">Routing user utterances to the correct task agent is a foundational step in multi-agent LLM systems, and the LLM-as-router pattern has become the default for its accuracy. We ask whether that accuracy is worth its cost. On CLINC150 (150 intents mapped to 7 agents + OOS), we compare four routers spanning a 3-order-of-magnitude cost range: (R1) keyword, (R2) embedding-nearest-centroid, (R3) Claude Haiku 4.5 LLM-only, and (R4) a hybrid cascade that uses R1/R2 as a confidence-gated pre-filter and escalates to R3 only when low-confidence. Across 3 seeds of 400 stratified queries (1,200 pooled), R4 achieves </w:t>
+        <w:t xml:space="preserve">Routing user utterances to the correct task agent is a foundational step in multi-agent LLM systems, and the LLM-as-router pattern has become the default for its accuracy. We ask whether that accuracy is worth its cost. On the CLINC150 benchmark (150 intents mapped to 7 agents + OOS), we compare four routers spanning a 3-order-of-magnitude cost range: (R1) keyword, (R2) embedding-nearest-centroid, (R3) Claude Haiku 4.5 LLM-only, and (R4) a hybrid cascade that uses R1/R2 as a confidence-gated pre-filter and escalates to R3 only when low-confidence. Across 3 seeds of 400 stratified queries (1,200 pooled), R4 achieves </w:t>
       </w:r>
       <w:r>
         <w:rPr>
@@ -144,7 +144,7 @@
           <w:sz w:val="22"/>
           <w:szCs w:val="22"/>
         </w:rPr>
-        <w:t xml:space="preserve"> — statistically indistinguishable by McNemar paired test (p &gt; 0.37) — while escalating to the LLM on only </w:t>
+        <w:t xml:space="preserve"> — statistically indistinguishable by McNemar paired test (p &gt; 0.37, overlapping Wilson 95% CIs) — while escalating to the LLM on only </w:t>
       </w:r>
       <w:r>
         <w:rPr>
@@ -180,7 +180,7 @@
           <w:sz w:val="22"/>
           <w:szCs w:val="22"/>
         </w:rPr>
-        <w:t xml:space="preserve">. We release code, tuned thresholds, and per-seed trajectories.</w:t>
+        <w:t xml:space="preserve">. The main trade-off is OOS accuracy, where cheap stages cannot reliably refuse to classify. We release code, tuned thresholds, and per-seed trajectories.</w:t>
       </w:r>
     </w:p>
     <w:p>
@@ -732,7 +732,7 @@
           <w:sz w:val="22"/>
           <w:szCs w:val="22"/>
         </w:rPr>
-        <w:t xml:space="preserve">Thresholds are tuned on a held-out validation split via grid search over kt ∈ {0.5, 1.0, 1.5, 2.0} and et ∈ {0.05, 0.08, 0.10, 0.15}. The objective maximises accuracy − 0.1 · LLM_call_rate, which prefers configurations that trade LLM calls for cheap-stage calls at equal accuracy. The tuned values for R4+LLM are kt = 0.5, et = 0.10.</w:t>
+        <w:t xml:space="preserve">Thresholds are tuned on the CLINC150 validation split (3,100 queries, disjoint from the test set) via grid search over kt ∈ {0.5, 1.0, 1.5, 2.0} and et ∈ {0.05, 0.08, 0.10, 0.15}. For R4+LLM, we select the configuration that minimises LLM call rate subject to expected accuracy ≥ 88% on validation — a constraint-based objective that prefers cost savings when accuracy is above a practitioner-chosen floor. The tuned values are kt = 0.5, et = 0.10 (22.7% LLM call rate on validation). We report a sensitivity analysis over the cost penalty α in §4.5, showing how the optimal operating point shifts across the Pareto frontier.</w:t>
       </w:r>
     </w:p>
     <w:p>
@@ -2636,7 +2636,7 @@
           <w:sz w:val="22"/>
           <w:szCs w:val="22"/>
         </w:rPr>
-        <w:t xml:space="preserve">Across all three seeds the difference is not significant. R4+LLM is statistically indistinguishable from R3.</w:t>
+        <w:t xml:space="preserve">Across all three seeds the difference is not significant. The Wilson 95% confidence intervals also overlap substantially — R3: [80.7%, 84.9%] vs R4: [80.3%, 84.6%] — corroborating the absence of a significant accuracy difference. R4+LLM is statistically indistinguishable from R3.</w:t>
       </w:r>
     </w:p>
     <w:p>
@@ -2850,15 +2850,15 @@
           <w:sz w:val="22"/>
           <w:szCs w:val="22"/>
         </w:rPr>
-        <w:t xml:space="preserve">57.5% stop at R1</w:t>
-      </w:r>
-      <w:r>
-        <w:rPr>
-          <w:rFonts w:ascii="Times New Roman" w:cs="Times New Roman" w:eastAsia="Times New Roman" w:hAnsi="Times New Roman"/>
-          <w:sz w:val="22"/>
-          <w:szCs w:val="22"/>
-        </w:rPr>
-        <w:t xml:space="preserve"> (88.7% accurate), </w:t>
+        <w:t xml:space="preserve">59.3% stop at R1</w:t>
+      </w:r>
+      <w:r>
+        <w:rPr>
+          <w:rFonts w:ascii="Times New Roman" w:cs="Times New Roman" w:eastAsia="Times New Roman" w:hAnsi="Times New Roman"/>
+          <w:sz w:val="22"/>
+          <w:szCs w:val="22"/>
+        </w:rPr>
+        <w:t xml:space="preserve"> (11.0% error), </w:t>
       </w:r>
       <w:r>
         <w:rPr>
@@ -2876,7 +2876,7 @@
           <w:sz w:val="22"/>
           <w:szCs w:val="22"/>
         </w:rPr>
-        <w:t xml:space="preserve"> (75.0% accurate), </w:t>
+        <w:t xml:space="preserve"> (16.2% error), </w:t>
       </w:r>
       <w:r>
         <w:rPr>
@@ -2886,15 +2886,33 @@
           <w:sz w:val="22"/>
           <w:szCs w:val="22"/>
         </w:rPr>
-        <w:t xml:space="preserve">25.5% escalate to R3</w:t>
-      </w:r>
-      <w:r>
-        <w:rPr>
-          <w:rFonts w:ascii="Times New Roman" w:cs="Times New Roman" w:eastAsia="Times New Roman" w:hAnsi="Times New Roman"/>
-          <w:sz w:val="22"/>
-          <w:szCs w:val="22"/>
-        </w:rPr>
-        <w:t xml:space="preserve">. Two patterns dominate R1’s 11.3% error rate: polysemous tokens (“call” triggers productivity instead of device, “visa” triggers travel instead of finance) and OOS leakage (the keyword router cannot refuse to classify). The cascade correctly escalates 64% of OOS queries to the LLM versus 10–18% for most in-domain agents.</w:t>
+        <w:t xml:space="preserve">23.8% escalate to R3</w:t>
+      </w:r>
+      <w:r>
+        <w:rPr>
+          <w:rFonts w:ascii="Times New Roman" w:cs="Times New Roman" w:eastAsia="Times New Roman" w:hAnsi="Times New Roman"/>
+          <w:sz w:val="22"/>
+          <w:szCs w:val="22"/>
+        </w:rPr>
+        <w:t xml:space="preserve">. R2 processes harder queries than R1, explaining its higher error rate. The most revealing finding is the </w:t>
+      </w:r>
+      <w:r>
+        <w:rPr>
+          <w:rFonts w:ascii="Times New Roman" w:cs="Times New Roman" w:eastAsia="Times New Roman" w:hAnsi="Times New Roman"/>
+          <w:b/>
+          <w:bCs/>
+          <w:sz w:val="22"/>
+          <w:szCs w:val="22"/>
+        </w:rPr>
+        <w:t xml:space="preserve">device agent</w:t>
+      </w:r>
+      <w:r>
+        <w:rPr>
+          <w:rFonts w:ascii="Times New Roman" w:cs="Times New Roman" w:eastAsia="Times New Roman" w:hAnsi="Times New Roman"/>
+          <w:sz w:val="22"/>
+          <w:szCs w:val="22"/>
+        </w:rPr>
+        <w:t xml:space="preserve">: R1 misclassifies 22.2% of its stops (polysemous tokens like “call” and “alarm”), but R2 recovers with only 4.3% error — embedding similarity correctly disambiguates commands that keywords cannot. OOS remains the weakest link: all 7 R1-stopped OOS queries and 5 of 9 R2-stopped OOS queries are wrong, confirming that a dedicated OOS detector would be the highest-impact improvement.</w:t>
       </w:r>
     </w:p>
     <w:p>
@@ -2920,7 +2938,7 @@
           <w:sz w:val="20"/>
           <w:szCs w:val="20"/>
         </w:rPr>
-        <w:t xml:space="preserve"> Escalation rate and R1-stop error rate by agent (seed 42, n=400).</w:t>
+        <w:t xml:space="preserve"> Per-stage error rate and escalation rate by agent (seed 42, n=400).</w:t>
       </w:r>
     </w:p>
     <w:tbl>
@@ -2936,15 +2954,18 @@
         </w:tblBorders>
       </w:tblPr>
       <w:tblGrid>
-        <w:gridCol w:w="2000"/>
-        <w:gridCol w:w="2000"/>
-        <w:gridCol w:w="2200"/>
-        <w:gridCol w:w="3160"/>
+        <w:gridCol w:w="1600"/>
+        <w:gridCol w:w="1200"/>
+        <w:gridCol w:w="1200"/>
+        <w:gridCol w:w="1200"/>
+        <w:gridCol w:w="1200"/>
+        <w:gridCol w:w="1100"/>
+        <w:gridCol w:w="1860"/>
       </w:tblGrid>
       <w:tr>
         <w:tc>
           <w:tcPr>
-            <w:tcW w:type="dxa" w:w="2000"/>
+            <w:tcW w:type="dxa" w:w="1600"/>
             <w:tcBorders>
               <w:top w:val="single" w:color="999999" w:sz="1"/>
               <w:left w:val="single" w:color="999999" w:sz="1"/>
@@ -2975,7 +2996,7 @@
         </w:tc>
         <w:tc>
           <w:tcPr>
-            <w:tcW w:type="dxa" w:w="2000"/>
+            <w:tcW w:type="dxa" w:w="1200"/>
             <w:tcBorders>
               <w:top w:val="single" w:color="999999" w:sz="1"/>
               <w:left w:val="single" w:color="999999" w:sz="1"/>
@@ -3000,13 +3021,13 @@
                 <w:sz w:val="18"/>
                 <w:szCs w:val="18"/>
               </w:rPr>
-              <w:t xml:space="preserve">Escalation</w:t>
-            </w:r>
-          </w:p>
-        </w:tc>
-        <w:tc>
-          <w:tcPr>
-            <w:tcW w:type="dxa" w:w="2200"/>
+              <w:t xml:space="preserve">R1 (n)</w:t>
+            </w:r>
+          </w:p>
+        </w:tc>
+        <w:tc>
+          <w:tcPr>
+            <w:tcW w:type="dxa" w:w="1200"/>
             <w:tcBorders>
               <w:top w:val="single" w:color="999999" w:sz="1"/>
               <w:left w:val="single" w:color="999999" w:sz="1"/>
@@ -3031,13 +3052,106 @@
                 <w:sz w:val="18"/>
                 <w:szCs w:val="18"/>
               </w:rPr>
-              <w:t xml:space="preserve">R1-stop error</w:t>
-            </w:r>
-          </w:p>
-        </w:tc>
-        <w:tc>
-          <w:tcPr>
-            <w:tcW w:type="dxa" w:w="3160"/>
+              <w:t xml:space="preserve">R1-err</w:t>
+            </w:r>
+          </w:p>
+        </w:tc>
+        <w:tc>
+          <w:tcPr>
+            <w:tcW w:type="dxa" w:w="1200"/>
+            <w:tcBorders>
+              <w:top w:val="single" w:color="999999" w:sz="1"/>
+              <w:left w:val="single" w:color="999999" w:sz="1"/>
+              <w:bottom w:val="single" w:color="999999" w:sz="1"/>
+              <w:right w:val="single" w:color="999999" w:sz="1"/>
+            </w:tcBorders>
+            <w:shd w:fill="E8F4FD" w:val="clear"/>
+            <w:tcMar>
+              <w:top w:type="dxa" w:w="40"/>
+              <w:left w:type="dxa" w:w="80"/>
+              <w:bottom w:type="dxa" w:w="40"/>
+              <w:right w:type="dxa" w:w="80"/>
+            </w:tcMar>
+          </w:tcPr>
+          <w:p>
+            <w:pPr>
+              <w:jc w:val="left"/>
+            </w:pPr>
+            <w:r>
+              <w:rPr>
+                <w:rFonts w:ascii="Times New Roman" w:cs="Times New Roman" w:eastAsia="Times New Roman" w:hAnsi="Times New Roman"/>
+                <w:sz w:val="18"/>
+                <w:szCs w:val="18"/>
+              </w:rPr>
+              <w:t xml:space="preserve">R2 (n)</w:t>
+            </w:r>
+          </w:p>
+        </w:tc>
+        <w:tc>
+          <w:tcPr>
+            <w:tcW w:type="dxa" w:w="1200"/>
+            <w:tcBorders>
+              <w:top w:val="single" w:color="999999" w:sz="1"/>
+              <w:left w:val="single" w:color="999999" w:sz="1"/>
+              <w:bottom w:val="single" w:color="999999" w:sz="1"/>
+              <w:right w:val="single" w:color="999999" w:sz="1"/>
+            </w:tcBorders>
+            <w:shd w:fill="E8F4FD" w:val="clear"/>
+            <w:tcMar>
+              <w:top w:type="dxa" w:w="40"/>
+              <w:left w:type="dxa" w:w="80"/>
+              <w:bottom w:type="dxa" w:w="40"/>
+              <w:right w:type="dxa" w:w="80"/>
+            </w:tcMar>
+          </w:tcPr>
+          <w:p>
+            <w:pPr>
+              <w:jc w:val="left"/>
+            </w:pPr>
+            <w:r>
+              <w:rPr>
+                <w:rFonts w:ascii="Times New Roman" w:cs="Times New Roman" w:eastAsia="Times New Roman" w:hAnsi="Times New Roman"/>
+                <w:sz w:val="18"/>
+                <w:szCs w:val="18"/>
+              </w:rPr>
+              <w:t xml:space="preserve">R2-err</w:t>
+            </w:r>
+          </w:p>
+        </w:tc>
+        <w:tc>
+          <w:tcPr>
+            <w:tcW w:type="dxa" w:w="1100"/>
+            <w:tcBorders>
+              <w:top w:val="single" w:color="999999" w:sz="1"/>
+              <w:left w:val="single" w:color="999999" w:sz="1"/>
+              <w:bottom w:val="single" w:color="999999" w:sz="1"/>
+              <w:right w:val="single" w:color="999999" w:sz="1"/>
+            </w:tcBorders>
+            <w:shd w:fill="E8F4FD" w:val="clear"/>
+            <w:tcMar>
+              <w:top w:type="dxa" w:w="40"/>
+              <w:left w:type="dxa" w:w="80"/>
+              <w:bottom w:type="dxa" w:w="40"/>
+              <w:right w:type="dxa" w:w="80"/>
+            </w:tcMar>
+          </w:tcPr>
+          <w:p>
+            <w:pPr>
+              <w:jc w:val="left"/>
+            </w:pPr>
+            <w:r>
+              <w:rPr>
+                <w:rFonts w:ascii="Times New Roman" w:cs="Times New Roman" w:eastAsia="Times New Roman" w:hAnsi="Times New Roman"/>
+                <w:sz w:val="18"/>
+                <w:szCs w:val="18"/>
+              </w:rPr>
+              <w:t xml:space="preserve">Esc%</w:t>
+            </w:r>
+          </w:p>
+        </w:tc>
+        <w:tc>
+          <w:tcPr>
+            <w:tcW w:type="dxa" w:w="1860"/>
             <w:tcBorders>
               <w:top w:val="single" w:color="999999" w:sz="1"/>
               <w:left w:val="single" w:color="999999" w:sz="1"/>
@@ -3070,121 +3184,211 @@
       <w:tr>
         <w:tc>
           <w:tcPr>
-            <w:tcW w:type="dxa" w:w="2000"/>
-            <w:tcBorders>
-              <w:top w:val="single" w:color="999999" w:sz="1"/>
-              <w:left w:val="single" w:color="999999" w:sz="1"/>
-              <w:bottom w:val="single" w:color="999999" w:sz="1"/>
-              <w:right w:val="single" w:color="999999" w:sz="1"/>
-            </w:tcBorders>
-            <w:tcMar>
-              <w:top w:type="dxa" w:w="40"/>
-              <w:left w:type="dxa" w:w="80"/>
-              <w:bottom w:type="dxa" w:w="40"/>
-              <w:right w:type="dxa" w:w="80"/>
-            </w:tcMar>
-          </w:tcPr>
-          <w:p>
-            <w:pPr>
-              <w:jc w:val="left"/>
-            </w:pPr>
-            <w:r>
-              <w:rPr>
-                <w:rFonts w:ascii="Times New Roman" w:cs="Times New Roman" w:eastAsia="Times New Roman" w:hAnsi="Times New Roman"/>
-                <w:sz w:val="18"/>
-                <w:szCs w:val="18"/>
-              </w:rPr>
-              <w:t xml:space="preserve">travel</w:t>
-            </w:r>
-          </w:p>
-        </w:tc>
-        <w:tc>
-          <w:tcPr>
-            <w:tcW w:type="dxa" w:w="2000"/>
-            <w:tcBorders>
-              <w:top w:val="single" w:color="999999" w:sz="1"/>
-              <w:left w:val="single" w:color="999999" w:sz="1"/>
-              <w:bottom w:val="single" w:color="999999" w:sz="1"/>
-              <w:right w:val="single" w:color="999999" w:sz="1"/>
-            </w:tcBorders>
-            <w:tcMar>
-              <w:top w:type="dxa" w:w="40"/>
-              <w:left w:type="dxa" w:w="80"/>
-              <w:bottom w:type="dxa" w:w="40"/>
-              <w:right w:type="dxa" w:w="80"/>
-            </w:tcMar>
-          </w:tcPr>
-          <w:p>
-            <w:pPr>
-              <w:jc w:val="left"/>
-            </w:pPr>
-            <w:r>
-              <w:rPr>
-                <w:rFonts w:ascii="Times New Roman" w:cs="Times New Roman" w:eastAsia="Times New Roman" w:hAnsi="Times New Roman"/>
-                <w:sz w:val="18"/>
-                <w:szCs w:val="18"/>
-              </w:rPr>
-              <w:t xml:space="preserve">10.0%</w:t>
-            </w:r>
-          </w:p>
-        </w:tc>
-        <w:tc>
-          <w:tcPr>
-            <w:tcW w:type="dxa" w:w="2200"/>
-            <w:tcBorders>
-              <w:top w:val="single" w:color="999999" w:sz="1"/>
-              <w:left w:val="single" w:color="999999" w:sz="1"/>
-              <w:bottom w:val="single" w:color="999999" w:sz="1"/>
-              <w:right w:val="single" w:color="999999" w:sz="1"/>
-            </w:tcBorders>
-            <w:tcMar>
-              <w:top w:type="dxa" w:w="40"/>
-              <w:left w:type="dxa" w:w="80"/>
-              <w:bottom w:type="dxa" w:w="40"/>
-              <w:right w:type="dxa" w:w="80"/>
-            </w:tcMar>
-          </w:tcPr>
-          <w:p>
-            <w:pPr>
-              <w:jc w:val="left"/>
-            </w:pPr>
-            <w:r>
-              <w:rPr>
-                <w:rFonts w:ascii="Times New Roman" w:cs="Times New Roman" w:eastAsia="Times New Roman" w:hAnsi="Times New Roman"/>
-                <w:sz w:val="18"/>
-                <w:szCs w:val="18"/>
-              </w:rPr>
-              <w:t xml:space="preserve">9.5%</w:t>
-            </w:r>
-          </w:p>
-        </w:tc>
-        <w:tc>
-          <w:tcPr>
-            <w:tcW w:type="dxa" w:w="3160"/>
-            <w:tcBorders>
-              <w:top w:val="single" w:color="999999" w:sz="1"/>
-              <w:left w:val="single" w:color="999999" w:sz="1"/>
-              <w:bottom w:val="single" w:color="999999" w:sz="1"/>
-              <w:right w:val="single" w:color="999999" w:sz="1"/>
-            </w:tcBorders>
-            <w:tcMar>
-              <w:top w:type="dxa" w:w="40"/>
-              <w:left w:type="dxa" w:w="80"/>
-              <w:bottom w:type="dxa" w:w="40"/>
-              <w:right w:type="dxa" w:w="80"/>
-            </w:tcMar>
-          </w:tcPr>
-          <w:p>
-            <w:pPr>
-              <w:jc w:val="left"/>
-            </w:pPr>
-            <w:r>
-              <w:rPr>
-                <w:rFonts w:ascii="Times New Roman" w:cs="Times New Roman" w:eastAsia="Times New Roman" w:hAnsi="Times New Roman"/>
-                <w:sz w:val="18"/>
-                <w:szCs w:val="18"/>
-              </w:rPr>
-              <w:t xml:space="preserve">Easy: domain verbs</w:t>
+            <w:tcW w:type="dxa" w:w="1600"/>
+            <w:tcBorders>
+              <w:top w:val="single" w:color="999999" w:sz="1"/>
+              <w:left w:val="single" w:color="999999" w:sz="1"/>
+              <w:bottom w:val="single" w:color="999999" w:sz="1"/>
+              <w:right w:val="single" w:color="999999" w:sz="1"/>
+            </w:tcBorders>
+            <w:tcMar>
+              <w:top w:type="dxa" w:w="40"/>
+              <w:left w:type="dxa" w:w="80"/>
+              <w:bottom w:type="dxa" w:w="40"/>
+              <w:right w:type="dxa" w:w="80"/>
+            </w:tcMar>
+          </w:tcPr>
+          <w:p>
+            <w:pPr>
+              <w:jc w:val="left"/>
+            </w:pPr>
+            <w:r>
+              <w:rPr>
+                <w:rFonts w:ascii="Times New Roman" w:cs="Times New Roman" w:eastAsia="Times New Roman" w:hAnsi="Times New Roman"/>
+                <w:sz w:val="18"/>
+                <w:szCs w:val="18"/>
+              </w:rPr>
+              <w:t xml:space="preserve">finance</w:t>
+            </w:r>
+          </w:p>
+        </w:tc>
+        <w:tc>
+          <w:tcPr>
+            <w:tcW w:type="dxa" w:w="1200"/>
+            <w:tcBorders>
+              <w:top w:val="single" w:color="999999" w:sz="1"/>
+              <w:left w:val="single" w:color="999999" w:sz="1"/>
+              <w:bottom w:val="single" w:color="999999" w:sz="1"/>
+              <w:right w:val="single" w:color="999999" w:sz="1"/>
+            </w:tcBorders>
+            <w:tcMar>
+              <w:top w:type="dxa" w:w="40"/>
+              <w:left w:type="dxa" w:w="80"/>
+              <w:bottom w:type="dxa" w:w="40"/>
+              <w:right w:type="dxa" w:w="80"/>
+            </w:tcMar>
+          </w:tcPr>
+          <w:p>
+            <w:pPr>
+              <w:jc w:val="left"/>
+            </w:pPr>
+            <w:r>
+              <w:rPr>
+                <w:rFonts w:ascii="Times New Roman" w:cs="Times New Roman" w:eastAsia="Times New Roman" w:hAnsi="Times New Roman"/>
+                <w:sz w:val="18"/>
+                <w:szCs w:val="18"/>
+              </w:rPr>
+              <w:t xml:space="preserve">49</w:t>
+            </w:r>
+          </w:p>
+        </w:tc>
+        <w:tc>
+          <w:tcPr>
+            <w:tcW w:type="dxa" w:w="1200"/>
+            <w:tcBorders>
+              <w:top w:val="single" w:color="999999" w:sz="1"/>
+              <w:left w:val="single" w:color="999999" w:sz="1"/>
+              <w:bottom w:val="single" w:color="999999" w:sz="1"/>
+              <w:right w:val="single" w:color="999999" w:sz="1"/>
+            </w:tcBorders>
+            <w:tcMar>
+              <w:top w:type="dxa" w:w="40"/>
+              <w:left w:type="dxa" w:w="80"/>
+              <w:bottom w:type="dxa" w:w="40"/>
+              <w:right w:type="dxa" w:w="80"/>
+            </w:tcMar>
+          </w:tcPr>
+          <w:p>
+            <w:pPr>
+              <w:jc w:val="left"/>
+            </w:pPr>
+            <w:r>
+              <w:rPr>
+                <w:rFonts w:ascii="Times New Roman" w:cs="Times New Roman" w:eastAsia="Times New Roman" w:hAnsi="Times New Roman"/>
+                <w:sz w:val="18"/>
+                <w:szCs w:val="18"/>
+              </w:rPr>
+              <w:t xml:space="preserve">4.1%</w:t>
+            </w:r>
+          </w:p>
+        </w:tc>
+        <w:tc>
+          <w:tcPr>
+            <w:tcW w:type="dxa" w:w="1200"/>
+            <w:tcBorders>
+              <w:top w:val="single" w:color="999999" w:sz="1"/>
+              <w:left w:val="single" w:color="999999" w:sz="1"/>
+              <w:bottom w:val="single" w:color="999999" w:sz="1"/>
+              <w:right w:val="single" w:color="999999" w:sz="1"/>
+            </w:tcBorders>
+            <w:tcMar>
+              <w:top w:type="dxa" w:w="40"/>
+              <w:left w:type="dxa" w:w="80"/>
+              <w:bottom w:type="dxa" w:w="40"/>
+              <w:right w:type="dxa" w:w="80"/>
+            </w:tcMar>
+          </w:tcPr>
+          <w:p>
+            <w:pPr>
+              <w:jc w:val="left"/>
+            </w:pPr>
+            <w:r>
+              <w:rPr>
+                <w:rFonts w:ascii="Times New Roman" w:cs="Times New Roman" w:eastAsia="Times New Roman" w:hAnsi="Times New Roman"/>
+                <w:sz w:val="18"/>
+                <w:szCs w:val="18"/>
+              </w:rPr>
+              <w:t xml:space="preserve">0</w:t>
+            </w:r>
+          </w:p>
+        </w:tc>
+        <w:tc>
+          <w:tcPr>
+            <w:tcW w:type="dxa" w:w="1200"/>
+            <w:tcBorders>
+              <w:top w:val="single" w:color="999999" w:sz="1"/>
+              <w:left w:val="single" w:color="999999" w:sz="1"/>
+              <w:bottom w:val="single" w:color="999999" w:sz="1"/>
+              <w:right w:val="single" w:color="999999" w:sz="1"/>
+            </w:tcBorders>
+            <w:tcMar>
+              <w:top w:type="dxa" w:w="40"/>
+              <w:left w:type="dxa" w:w="80"/>
+              <w:bottom w:type="dxa" w:w="40"/>
+              <w:right w:type="dxa" w:w="80"/>
+            </w:tcMar>
+          </w:tcPr>
+          <w:p>
+            <w:pPr>
+              <w:jc w:val="left"/>
+            </w:pPr>
+            <w:r>
+              <w:rPr>
+                <w:rFonts w:ascii="Times New Roman" w:cs="Times New Roman" w:eastAsia="Times New Roman" w:hAnsi="Times New Roman"/>
+                <w:sz w:val="18"/>
+                <w:szCs w:val="18"/>
+              </w:rPr>
+              <w:t xml:space="preserve">—</w:t>
+            </w:r>
+          </w:p>
+        </w:tc>
+        <w:tc>
+          <w:tcPr>
+            <w:tcW w:type="dxa" w:w="1100"/>
+            <w:tcBorders>
+              <w:top w:val="single" w:color="999999" w:sz="1"/>
+              <w:left w:val="single" w:color="999999" w:sz="1"/>
+              <w:bottom w:val="single" w:color="999999" w:sz="1"/>
+              <w:right w:val="single" w:color="999999" w:sz="1"/>
+            </w:tcBorders>
+            <w:tcMar>
+              <w:top w:type="dxa" w:w="40"/>
+              <w:left w:type="dxa" w:w="80"/>
+              <w:bottom w:type="dxa" w:w="40"/>
+              <w:right w:type="dxa" w:w="80"/>
+            </w:tcMar>
+          </w:tcPr>
+          <w:p>
+            <w:pPr>
+              <w:jc w:val="left"/>
+            </w:pPr>
+            <w:r>
+              <w:rPr>
+                <w:rFonts w:ascii="Times New Roman" w:cs="Times New Roman" w:eastAsia="Times New Roman" w:hAnsi="Times New Roman"/>
+                <w:sz w:val="18"/>
+                <w:szCs w:val="18"/>
+              </w:rPr>
+              <w:t xml:space="preserve">2.0%</w:t>
+            </w:r>
+          </w:p>
+        </w:tc>
+        <w:tc>
+          <w:tcPr>
+            <w:tcW w:type="dxa" w:w="1860"/>
+            <w:tcBorders>
+              <w:top w:val="single" w:color="999999" w:sz="1"/>
+              <w:left w:val="single" w:color="999999" w:sz="1"/>
+              <w:bottom w:val="single" w:color="999999" w:sz="1"/>
+              <w:right w:val="single" w:color="999999" w:sz="1"/>
+            </w:tcBorders>
+            <w:tcMar>
+              <w:top w:type="dxa" w:w="40"/>
+              <w:left w:type="dxa" w:w="80"/>
+              <w:bottom w:type="dxa" w:w="40"/>
+              <w:right w:type="dxa" w:w="80"/>
+            </w:tcMar>
+          </w:tcPr>
+          <w:p>
+            <w:pPr>
+              <w:jc w:val="left"/>
+            </w:pPr>
+            <w:r>
+              <w:rPr>
+                <w:rFonts w:ascii="Times New Roman" w:cs="Times New Roman" w:eastAsia="Times New Roman" w:hAnsi="Times New Roman"/>
+                <w:sz w:val="18"/>
+                <w:szCs w:val="18"/>
+              </w:rPr>
+              <w:t xml:space="preserve">Easiest</w:t>
             </w:r>
           </w:p>
         </w:tc>
@@ -3192,7 +3396,7 @@
       <w:tr>
         <w:tc>
           <w:tcPr>
-            <w:tcW w:type="dxa" w:w="2000"/>
+            <w:tcW w:type="dxa" w:w="1600"/>
             <w:tcBorders>
               <w:top w:val="single" w:color="999999" w:sz="1"/>
               <w:left w:val="single" w:color="999999" w:sz="1"/>
@@ -3222,37 +3426,97 @@
         </w:tc>
         <w:tc>
           <w:tcPr>
-            <w:tcW w:type="dxa" w:w="2000"/>
-            <w:tcBorders>
-              <w:top w:val="single" w:color="999999" w:sz="1"/>
-              <w:left w:val="single" w:color="999999" w:sz="1"/>
-              <w:bottom w:val="single" w:color="999999" w:sz="1"/>
-              <w:right w:val="single" w:color="999999" w:sz="1"/>
-            </w:tcBorders>
-            <w:tcMar>
-              <w:top w:type="dxa" w:w="40"/>
-              <w:left w:type="dxa" w:w="80"/>
-              <w:bottom w:type="dxa" w:w="40"/>
-              <w:right w:type="dxa" w:w="80"/>
-            </w:tcMar>
-          </w:tcPr>
-          <w:p>
-            <w:pPr>
-              <w:jc w:val="left"/>
-            </w:pPr>
-            <w:r>
-              <w:rPr>
-                <w:rFonts w:ascii="Times New Roman" w:cs="Times New Roman" w:eastAsia="Times New Roman" w:hAnsi="Times New Roman"/>
-                <w:sz w:val="18"/>
-                <w:szCs w:val="18"/>
-              </w:rPr>
-              <w:t xml:space="preserve">14.0%</w:t>
-            </w:r>
-          </w:p>
-        </w:tc>
-        <w:tc>
-          <w:tcPr>
-            <w:tcW w:type="dxa" w:w="2200"/>
+            <w:tcW w:type="dxa" w:w="1200"/>
+            <w:tcBorders>
+              <w:top w:val="single" w:color="999999" w:sz="1"/>
+              <w:left w:val="single" w:color="999999" w:sz="1"/>
+              <w:bottom w:val="single" w:color="999999" w:sz="1"/>
+              <w:right w:val="single" w:color="999999" w:sz="1"/>
+            </w:tcBorders>
+            <w:tcMar>
+              <w:top w:type="dxa" w:w="40"/>
+              <w:left w:type="dxa" w:w="80"/>
+              <w:bottom w:type="dxa" w:w="40"/>
+              <w:right w:type="dxa" w:w="80"/>
+            </w:tcMar>
+          </w:tcPr>
+          <w:p>
+            <w:pPr>
+              <w:jc w:val="left"/>
+            </w:pPr>
+            <w:r>
+              <w:rPr>
+                <w:rFonts w:ascii="Times New Roman" w:cs="Times New Roman" w:eastAsia="Times New Roman" w:hAnsi="Times New Roman"/>
+                <w:sz w:val="18"/>
+                <w:szCs w:val="18"/>
+              </w:rPr>
+              <w:t xml:space="preserve">45</w:t>
+            </w:r>
+          </w:p>
+        </w:tc>
+        <w:tc>
+          <w:tcPr>
+            <w:tcW w:type="dxa" w:w="1200"/>
+            <w:tcBorders>
+              <w:top w:val="single" w:color="999999" w:sz="1"/>
+              <w:left w:val="single" w:color="999999" w:sz="1"/>
+              <w:bottom w:val="single" w:color="999999" w:sz="1"/>
+              <w:right w:val="single" w:color="999999" w:sz="1"/>
+            </w:tcBorders>
+            <w:tcMar>
+              <w:top w:type="dxa" w:w="40"/>
+              <w:left w:type="dxa" w:w="80"/>
+              <w:bottom w:type="dxa" w:w="40"/>
+              <w:right w:type="dxa" w:w="80"/>
+            </w:tcMar>
+          </w:tcPr>
+          <w:p>
+            <w:pPr>
+              <w:jc w:val="left"/>
+            </w:pPr>
+            <w:r>
+              <w:rPr>
+                <w:rFonts w:ascii="Times New Roman" w:cs="Times New Roman" w:eastAsia="Times New Roman" w:hAnsi="Times New Roman"/>
+                <w:sz w:val="18"/>
+                <w:szCs w:val="18"/>
+              </w:rPr>
+              <w:t xml:space="preserve">2.2%</w:t>
+            </w:r>
+          </w:p>
+        </w:tc>
+        <w:tc>
+          <w:tcPr>
+            <w:tcW w:type="dxa" w:w="1200"/>
+            <w:tcBorders>
+              <w:top w:val="single" w:color="999999" w:sz="1"/>
+              <w:left w:val="single" w:color="999999" w:sz="1"/>
+              <w:bottom w:val="single" w:color="999999" w:sz="1"/>
+              <w:right w:val="single" w:color="999999" w:sz="1"/>
+            </w:tcBorders>
+            <w:tcMar>
+              <w:top w:type="dxa" w:w="40"/>
+              <w:left w:type="dxa" w:w="80"/>
+              <w:bottom w:type="dxa" w:w="40"/>
+              <w:right w:type="dxa" w:w="80"/>
+            </w:tcMar>
+          </w:tcPr>
+          <w:p>
+            <w:pPr>
+              <w:jc w:val="left"/>
+            </w:pPr>
+            <w:r>
+              <w:rPr>
+                <w:rFonts w:ascii="Times New Roman" w:cs="Times New Roman" w:eastAsia="Times New Roman" w:hAnsi="Times New Roman"/>
+                <w:sz w:val="18"/>
+                <w:szCs w:val="18"/>
+              </w:rPr>
+              <w:t xml:space="preserve">1</w:t>
+            </w:r>
+          </w:p>
+        </w:tc>
+        <w:tc>
+          <w:tcPr>
+            <w:tcW w:type="dxa" w:w="1200"/>
             <w:tcBorders>
               <w:top w:val="single" w:color="999999" w:sz="1"/>
               <w:left w:val="single" w:color="999999" w:sz="1"/>
@@ -3282,31 +3546,61 @@
         </w:tc>
         <w:tc>
           <w:tcPr>
-            <w:tcW w:type="dxa" w:w="3160"/>
-            <w:tcBorders>
-              <w:top w:val="single" w:color="999999" w:sz="1"/>
-              <w:left w:val="single" w:color="999999" w:sz="1"/>
-              <w:bottom w:val="single" w:color="999999" w:sz="1"/>
-              <w:right w:val="single" w:color="999999" w:sz="1"/>
-            </w:tcBorders>
-            <w:tcMar>
-              <w:top w:type="dxa" w:w="40"/>
-              <w:left w:type="dxa" w:w="80"/>
-              <w:bottom w:type="dxa" w:w="40"/>
-              <w:right w:type="dxa" w:w="80"/>
-            </w:tcMar>
-          </w:tcPr>
-          <w:p>
-            <w:pPr>
-              <w:jc w:val="left"/>
-            </w:pPr>
-            <w:r>
-              <w:rPr>
-                <w:rFonts w:ascii="Times New Roman" w:cs="Times New Roman" w:eastAsia="Times New Roman" w:hAnsi="Times New Roman"/>
-                <w:sz w:val="18"/>
-                <w:szCs w:val="18"/>
-              </w:rPr>
-              <w:t xml:space="preserve">Easy: keyword anchors</w:t>
+            <w:tcW w:type="dxa" w:w="1100"/>
+            <w:tcBorders>
+              <w:top w:val="single" w:color="999999" w:sz="1"/>
+              <w:left w:val="single" w:color="999999" w:sz="1"/>
+              <w:bottom w:val="single" w:color="999999" w:sz="1"/>
+              <w:right w:val="single" w:color="999999" w:sz="1"/>
+            </w:tcBorders>
+            <w:tcMar>
+              <w:top w:type="dxa" w:w="40"/>
+              <w:left w:type="dxa" w:w="80"/>
+              <w:bottom w:type="dxa" w:w="40"/>
+              <w:right w:type="dxa" w:w="80"/>
+            </w:tcMar>
+          </w:tcPr>
+          <w:p>
+            <w:pPr>
+              <w:jc w:val="left"/>
+            </w:pPr>
+            <w:r>
+              <w:rPr>
+                <w:rFonts w:ascii="Times New Roman" w:cs="Times New Roman" w:eastAsia="Times New Roman" w:hAnsi="Times New Roman"/>
+                <w:sz w:val="18"/>
+                <w:szCs w:val="18"/>
+              </w:rPr>
+              <w:t xml:space="preserve">8.0%</w:t>
+            </w:r>
+          </w:p>
+        </w:tc>
+        <w:tc>
+          <w:tcPr>
+            <w:tcW w:type="dxa" w:w="1860"/>
+            <w:tcBorders>
+              <w:top w:val="single" w:color="999999" w:sz="1"/>
+              <w:left w:val="single" w:color="999999" w:sz="1"/>
+              <w:bottom w:val="single" w:color="999999" w:sz="1"/>
+              <w:right w:val="single" w:color="999999" w:sz="1"/>
+            </w:tcBorders>
+            <w:tcMar>
+              <w:top w:type="dxa" w:w="40"/>
+              <w:left w:type="dxa" w:w="80"/>
+              <w:bottom w:type="dxa" w:w="40"/>
+              <w:right w:type="dxa" w:w="80"/>
+            </w:tcMar>
+          </w:tcPr>
+          <w:p>
+            <w:pPr>
+              <w:jc w:val="left"/>
+            </w:pPr>
+            <w:r>
+              <w:rPr>
+                <w:rFonts w:ascii="Times New Roman" w:cs="Times New Roman" w:eastAsia="Times New Roman" w:hAnsi="Times New Roman"/>
+                <w:sz w:val="18"/>
+                <w:szCs w:val="18"/>
+              </w:rPr>
+              <w:t xml:space="preserve">Strong keyword anchors</w:t>
             </w:r>
           </w:p>
         </w:tc>
@@ -3314,37 +3608,157 @@
       <w:tr>
         <w:tc>
           <w:tcPr>
-            <w:tcW w:type="dxa" w:w="2000"/>
-            <w:tcBorders>
-              <w:top w:val="single" w:color="999999" w:sz="1"/>
-              <w:left w:val="single" w:color="999999" w:sz="1"/>
-              <w:bottom w:val="single" w:color="999999" w:sz="1"/>
-              <w:right w:val="single" w:color="999999" w:sz="1"/>
-            </w:tcBorders>
-            <w:tcMar>
-              <w:top w:type="dxa" w:w="40"/>
-              <w:left w:type="dxa" w:w="80"/>
-              <w:bottom w:type="dxa" w:w="40"/>
-              <w:right w:type="dxa" w:w="80"/>
-            </w:tcMar>
-          </w:tcPr>
-          <w:p>
-            <w:pPr>
-              <w:jc w:val="left"/>
-            </w:pPr>
-            <w:r>
-              <w:rPr>
-                <w:rFonts w:ascii="Times New Roman" w:cs="Times New Roman" w:eastAsia="Times New Roman" w:hAnsi="Times New Roman"/>
-                <w:sz w:val="18"/>
-                <w:szCs w:val="18"/>
-              </w:rPr>
-              <w:t xml:space="preserve">finance</w:t>
-            </w:r>
-          </w:p>
-        </w:tc>
-        <w:tc>
-          <w:tcPr>
-            <w:tcW w:type="dxa" w:w="2000"/>
+            <w:tcW w:type="dxa" w:w="1600"/>
+            <w:tcBorders>
+              <w:top w:val="single" w:color="999999" w:sz="1"/>
+              <w:left w:val="single" w:color="999999" w:sz="1"/>
+              <w:bottom w:val="single" w:color="999999" w:sz="1"/>
+              <w:right w:val="single" w:color="999999" w:sz="1"/>
+            </w:tcBorders>
+            <w:tcMar>
+              <w:top w:type="dxa" w:w="40"/>
+              <w:left w:type="dxa" w:w="80"/>
+              <w:bottom w:type="dxa" w:w="40"/>
+              <w:right w:type="dxa" w:w="80"/>
+            </w:tcMar>
+          </w:tcPr>
+          <w:p>
+            <w:pPr>
+              <w:jc w:val="left"/>
+            </w:pPr>
+            <w:r>
+              <w:rPr>
+                <w:rFonts w:ascii="Times New Roman" w:cs="Times New Roman" w:eastAsia="Times New Roman" w:hAnsi="Times New Roman"/>
+                <w:sz w:val="18"/>
+                <w:szCs w:val="18"/>
+              </w:rPr>
+              <w:t xml:space="preserve">kitchen</w:t>
+            </w:r>
+          </w:p>
+        </w:tc>
+        <w:tc>
+          <w:tcPr>
+            <w:tcW w:type="dxa" w:w="1200"/>
+            <w:tcBorders>
+              <w:top w:val="single" w:color="999999" w:sz="1"/>
+              <w:left w:val="single" w:color="999999" w:sz="1"/>
+              <w:bottom w:val="single" w:color="999999" w:sz="1"/>
+              <w:right w:val="single" w:color="999999" w:sz="1"/>
+            </w:tcBorders>
+            <w:tcMar>
+              <w:top w:type="dxa" w:w="40"/>
+              <w:left w:type="dxa" w:w="80"/>
+              <w:bottom w:type="dxa" w:w="40"/>
+              <w:right w:type="dxa" w:w="80"/>
+            </w:tcMar>
+          </w:tcPr>
+          <w:p>
+            <w:pPr>
+              <w:jc w:val="left"/>
+            </w:pPr>
+            <w:r>
+              <w:rPr>
+                <w:rFonts w:ascii="Times New Roman" w:cs="Times New Roman" w:eastAsia="Times New Roman" w:hAnsi="Times New Roman"/>
+                <w:sz w:val="18"/>
+                <w:szCs w:val="18"/>
+              </w:rPr>
+              <w:t xml:space="preserve">30</w:t>
+            </w:r>
+          </w:p>
+        </w:tc>
+        <w:tc>
+          <w:tcPr>
+            <w:tcW w:type="dxa" w:w="1200"/>
+            <w:tcBorders>
+              <w:top w:val="single" w:color="999999" w:sz="1"/>
+              <w:left w:val="single" w:color="999999" w:sz="1"/>
+              <w:bottom w:val="single" w:color="999999" w:sz="1"/>
+              <w:right w:val="single" w:color="999999" w:sz="1"/>
+            </w:tcBorders>
+            <w:tcMar>
+              <w:top w:type="dxa" w:w="40"/>
+              <w:left w:type="dxa" w:w="80"/>
+              <w:bottom w:type="dxa" w:w="40"/>
+              <w:right w:type="dxa" w:w="80"/>
+            </w:tcMar>
+          </w:tcPr>
+          <w:p>
+            <w:pPr>
+              <w:jc w:val="left"/>
+            </w:pPr>
+            <w:r>
+              <w:rPr>
+                <w:rFonts w:ascii="Times New Roman" w:cs="Times New Roman" w:eastAsia="Times New Roman" w:hAnsi="Times New Roman"/>
+                <w:sz w:val="18"/>
+                <w:szCs w:val="18"/>
+              </w:rPr>
+              <w:t xml:space="preserve">13.3%</w:t>
+            </w:r>
+          </w:p>
+        </w:tc>
+        <w:tc>
+          <w:tcPr>
+            <w:tcW w:type="dxa" w:w="1200"/>
+            <w:tcBorders>
+              <w:top w:val="single" w:color="999999" w:sz="1"/>
+              <w:left w:val="single" w:color="999999" w:sz="1"/>
+              <w:bottom w:val="single" w:color="999999" w:sz="1"/>
+              <w:right w:val="single" w:color="999999" w:sz="1"/>
+            </w:tcBorders>
+            <w:tcMar>
+              <w:top w:type="dxa" w:w="40"/>
+              <w:left w:type="dxa" w:w="80"/>
+              <w:bottom w:type="dxa" w:w="40"/>
+              <w:right w:type="dxa" w:w="80"/>
+            </w:tcMar>
+          </w:tcPr>
+          <w:p>
+            <w:pPr>
+              <w:jc w:val="left"/>
+            </w:pPr>
+            <w:r>
+              <w:rPr>
+                <w:rFonts w:ascii="Times New Roman" w:cs="Times New Roman" w:eastAsia="Times New Roman" w:hAnsi="Times New Roman"/>
+                <w:sz w:val="18"/>
+                <w:szCs w:val="18"/>
+              </w:rPr>
+              <w:t xml:space="preserve">12</w:t>
+            </w:r>
+          </w:p>
+        </w:tc>
+        <w:tc>
+          <w:tcPr>
+            <w:tcW w:type="dxa" w:w="1200"/>
+            <w:tcBorders>
+              <w:top w:val="single" w:color="999999" w:sz="1"/>
+              <w:left w:val="single" w:color="999999" w:sz="1"/>
+              <w:bottom w:val="single" w:color="999999" w:sz="1"/>
+              <w:right w:val="single" w:color="999999" w:sz="1"/>
+            </w:tcBorders>
+            <w:tcMar>
+              <w:top w:type="dxa" w:w="40"/>
+              <w:left w:type="dxa" w:w="80"/>
+              <w:bottom w:type="dxa" w:w="40"/>
+              <w:right w:type="dxa" w:w="80"/>
+            </w:tcMar>
+          </w:tcPr>
+          <w:p>
+            <w:pPr>
+              <w:jc w:val="left"/>
+            </w:pPr>
+            <w:r>
+              <w:rPr>
+                <w:rFonts w:ascii="Times New Roman" w:cs="Times New Roman" w:eastAsia="Times New Roman" w:hAnsi="Times New Roman"/>
+                <w:sz w:val="18"/>
+                <w:szCs w:val="18"/>
+              </w:rPr>
+              <w:t xml:space="preserve">8.3%</w:t>
+            </w:r>
+          </w:p>
+        </w:tc>
+        <w:tc>
+          <w:tcPr>
+            <w:tcW w:type="dxa" w:w="1100"/>
             <w:tcBorders>
               <w:top w:val="single" w:color="999999" w:sz="1"/>
               <w:left w:val="single" w:color="999999" w:sz="1"/>
@@ -3374,61 +3788,31 @@
         </w:tc>
         <w:tc>
           <w:tcPr>
-            <w:tcW w:type="dxa" w:w="2200"/>
-            <w:tcBorders>
-              <w:top w:val="single" w:color="999999" w:sz="1"/>
-              <w:left w:val="single" w:color="999999" w:sz="1"/>
-              <w:bottom w:val="single" w:color="999999" w:sz="1"/>
-              <w:right w:val="single" w:color="999999" w:sz="1"/>
-            </w:tcBorders>
-            <w:tcMar>
-              <w:top w:type="dxa" w:w="40"/>
-              <w:left w:type="dxa" w:w="80"/>
-              <w:bottom w:type="dxa" w:w="40"/>
-              <w:right w:type="dxa" w:w="80"/>
-            </w:tcMar>
-          </w:tcPr>
-          <w:p>
-            <w:pPr>
-              <w:jc w:val="left"/>
-            </w:pPr>
-            <w:r>
-              <w:rPr>
-                <w:rFonts w:ascii="Times New Roman" w:cs="Times New Roman" w:eastAsia="Times New Roman" w:hAnsi="Times New Roman"/>
-                <w:sz w:val="18"/>
-                <w:szCs w:val="18"/>
-              </w:rPr>
-              <w:t xml:space="preserve">4.8%</w:t>
-            </w:r>
-          </w:p>
-        </w:tc>
-        <w:tc>
-          <w:tcPr>
-            <w:tcW w:type="dxa" w:w="3160"/>
-            <w:tcBorders>
-              <w:top w:val="single" w:color="999999" w:sz="1"/>
-              <w:left w:val="single" w:color="999999" w:sz="1"/>
-              <w:bottom w:val="single" w:color="999999" w:sz="1"/>
-              <w:right w:val="single" w:color="999999" w:sz="1"/>
-            </w:tcBorders>
-            <w:tcMar>
-              <w:top w:type="dxa" w:w="40"/>
-              <w:left w:type="dxa" w:w="80"/>
-              <w:bottom w:type="dxa" w:w="40"/>
-              <w:right w:type="dxa" w:w="80"/>
-            </w:tcMar>
-          </w:tcPr>
-          <w:p>
-            <w:pPr>
-              <w:jc w:val="left"/>
-            </w:pPr>
-            <w:r>
-              <w:rPr>
-                <w:rFonts w:ascii="Times New Roman" w:cs="Times New Roman" w:eastAsia="Times New Roman" w:hAnsi="Times New Roman"/>
-                <w:sz w:val="18"/>
-                <w:szCs w:val="18"/>
-              </w:rPr>
-              <w:t xml:space="preserve">Easy: financial nouns</w:t>
+            <w:tcW w:type="dxa" w:w="1860"/>
+            <w:tcBorders>
+              <w:top w:val="single" w:color="999999" w:sz="1"/>
+              <w:left w:val="single" w:color="999999" w:sz="1"/>
+              <w:bottom w:val="single" w:color="999999" w:sz="1"/>
+              <w:right w:val="single" w:color="999999" w:sz="1"/>
+            </w:tcBorders>
+            <w:tcMar>
+              <w:top w:type="dxa" w:w="40"/>
+              <w:left w:type="dxa" w:w="80"/>
+              <w:bottom w:type="dxa" w:w="40"/>
+              <w:right w:type="dxa" w:w="80"/>
+            </w:tcMar>
+          </w:tcPr>
+          <w:p>
+            <w:pPr>
+              <w:jc w:val="left"/>
+            </w:pPr>
+            <w:r>
+              <w:rPr>
+                <w:rFonts w:ascii="Times New Roman" w:cs="Times New Roman" w:eastAsia="Times New Roman" w:hAnsi="Times New Roman"/>
+                <w:sz w:val="18"/>
+                <w:szCs w:val="18"/>
+              </w:rPr>
+              <w:t xml:space="preserve">R2 catches R1 misses</w:t>
             </w:r>
           </w:p>
         </w:tc>
@@ -3436,37 +3820,157 @@
       <w:tr>
         <w:tc>
           <w:tcPr>
-            <w:tcW w:type="dxa" w:w="2000"/>
-            <w:tcBorders>
-              <w:top w:val="single" w:color="999999" w:sz="1"/>
-              <w:left w:val="single" w:color="999999" w:sz="1"/>
-              <w:bottom w:val="single" w:color="999999" w:sz="1"/>
-              <w:right w:val="single" w:color="999999" w:sz="1"/>
-            </w:tcBorders>
-            <w:tcMar>
-              <w:top w:type="dxa" w:w="40"/>
-              <w:left w:type="dxa" w:w="80"/>
-              <w:bottom w:type="dxa" w:w="40"/>
-              <w:right w:type="dxa" w:w="80"/>
-            </w:tcMar>
-          </w:tcPr>
-          <w:p>
-            <w:pPr>
-              <w:jc w:val="left"/>
-            </w:pPr>
-            <w:r>
-              <w:rPr>
-                <w:rFonts w:ascii="Times New Roman" w:cs="Times New Roman" w:eastAsia="Times New Roman" w:hAnsi="Times New Roman"/>
-                <w:sz w:val="18"/>
-                <w:szCs w:val="18"/>
-              </w:rPr>
-              <w:t xml:space="preserve">kitchen</w:t>
-            </w:r>
-          </w:p>
-        </w:tc>
-        <w:tc>
-          <w:tcPr>
-            <w:tcW w:type="dxa" w:w="2000"/>
+            <w:tcW w:type="dxa" w:w="1600"/>
+            <w:tcBorders>
+              <w:top w:val="single" w:color="999999" w:sz="1"/>
+              <w:left w:val="single" w:color="999999" w:sz="1"/>
+              <w:bottom w:val="single" w:color="999999" w:sz="1"/>
+              <w:right w:val="single" w:color="999999" w:sz="1"/>
+            </w:tcBorders>
+            <w:tcMar>
+              <w:top w:type="dxa" w:w="40"/>
+              <w:left w:type="dxa" w:w="80"/>
+              <w:bottom w:type="dxa" w:w="40"/>
+              <w:right w:type="dxa" w:w="80"/>
+            </w:tcMar>
+          </w:tcPr>
+          <w:p>
+            <w:pPr>
+              <w:jc w:val="left"/>
+            </w:pPr>
+            <w:r>
+              <w:rPr>
+                <w:rFonts w:ascii="Times New Roman" w:cs="Times New Roman" w:eastAsia="Times New Roman" w:hAnsi="Times New Roman"/>
+                <w:sz w:val="18"/>
+                <w:szCs w:val="18"/>
+              </w:rPr>
+              <w:t xml:space="preserve">device</w:t>
+            </w:r>
+          </w:p>
+        </w:tc>
+        <w:tc>
+          <w:tcPr>
+            <w:tcW w:type="dxa" w:w="1200"/>
+            <w:tcBorders>
+              <w:top w:val="single" w:color="999999" w:sz="1"/>
+              <w:left w:val="single" w:color="999999" w:sz="1"/>
+              <w:bottom w:val="single" w:color="999999" w:sz="1"/>
+              <w:right w:val="single" w:color="999999" w:sz="1"/>
+            </w:tcBorders>
+            <w:tcMar>
+              <w:top w:type="dxa" w:w="40"/>
+              <w:left w:type="dxa" w:w="80"/>
+              <w:bottom w:type="dxa" w:w="40"/>
+              <w:right w:type="dxa" w:w="80"/>
+            </w:tcMar>
+          </w:tcPr>
+          <w:p>
+            <w:pPr>
+              <w:jc w:val="left"/>
+            </w:pPr>
+            <w:r>
+              <w:rPr>
+                <w:rFonts w:ascii="Times New Roman" w:cs="Times New Roman" w:eastAsia="Times New Roman" w:hAnsi="Times New Roman"/>
+                <w:sz w:val="18"/>
+                <w:szCs w:val="18"/>
+              </w:rPr>
+              <w:t xml:space="preserve">18</w:t>
+            </w:r>
+          </w:p>
+        </w:tc>
+        <w:tc>
+          <w:tcPr>
+            <w:tcW w:type="dxa" w:w="1200"/>
+            <w:tcBorders>
+              <w:top w:val="single" w:color="999999" w:sz="1"/>
+              <w:left w:val="single" w:color="999999" w:sz="1"/>
+              <w:bottom w:val="single" w:color="999999" w:sz="1"/>
+              <w:right w:val="single" w:color="999999" w:sz="1"/>
+            </w:tcBorders>
+            <w:tcMar>
+              <w:top w:type="dxa" w:w="40"/>
+              <w:left w:type="dxa" w:w="80"/>
+              <w:bottom w:type="dxa" w:w="40"/>
+              <w:right w:type="dxa" w:w="80"/>
+            </w:tcMar>
+          </w:tcPr>
+          <w:p>
+            <w:pPr>
+              <w:jc w:val="left"/>
+            </w:pPr>
+            <w:r>
+              <w:rPr>
+                <w:rFonts w:ascii="Times New Roman" w:cs="Times New Roman" w:eastAsia="Times New Roman" w:hAnsi="Times New Roman"/>
+                <w:sz w:val="18"/>
+                <w:szCs w:val="18"/>
+              </w:rPr>
+              <w:t xml:space="preserve">22.2%</w:t>
+            </w:r>
+          </w:p>
+        </w:tc>
+        <w:tc>
+          <w:tcPr>
+            <w:tcW w:type="dxa" w:w="1200"/>
+            <w:tcBorders>
+              <w:top w:val="single" w:color="999999" w:sz="1"/>
+              <w:left w:val="single" w:color="999999" w:sz="1"/>
+              <w:bottom w:val="single" w:color="999999" w:sz="1"/>
+              <w:right w:val="single" w:color="999999" w:sz="1"/>
+            </w:tcBorders>
+            <w:tcMar>
+              <w:top w:type="dxa" w:w="40"/>
+              <w:left w:type="dxa" w:w="80"/>
+              <w:bottom w:type="dxa" w:w="40"/>
+              <w:right w:type="dxa" w:w="80"/>
+            </w:tcMar>
+          </w:tcPr>
+          <w:p>
+            <w:pPr>
+              <w:jc w:val="left"/>
+            </w:pPr>
+            <w:r>
+              <w:rPr>
+                <w:rFonts w:ascii="Times New Roman" w:cs="Times New Roman" w:eastAsia="Times New Roman" w:hAnsi="Times New Roman"/>
+                <w:sz w:val="18"/>
+                <w:szCs w:val="18"/>
+              </w:rPr>
+              <w:t xml:space="preserve">23</w:t>
+            </w:r>
+          </w:p>
+        </w:tc>
+        <w:tc>
+          <w:tcPr>
+            <w:tcW w:type="dxa" w:w="1200"/>
+            <w:tcBorders>
+              <w:top w:val="single" w:color="999999" w:sz="1"/>
+              <w:left w:val="single" w:color="999999" w:sz="1"/>
+              <w:bottom w:val="single" w:color="999999" w:sz="1"/>
+              <w:right w:val="single" w:color="999999" w:sz="1"/>
+            </w:tcBorders>
+            <w:tcMar>
+              <w:top w:type="dxa" w:w="40"/>
+              <w:left w:type="dxa" w:w="80"/>
+              <w:bottom w:type="dxa" w:w="40"/>
+              <w:right w:type="dxa" w:w="80"/>
+            </w:tcMar>
+          </w:tcPr>
+          <w:p>
+            <w:pPr>
+              <w:jc w:val="left"/>
+            </w:pPr>
+            <w:r>
+              <w:rPr>
+                <w:rFonts w:ascii="Times New Roman" w:cs="Times New Roman" w:eastAsia="Times New Roman" w:hAnsi="Times New Roman"/>
+                <w:sz w:val="18"/>
+                <w:szCs w:val="18"/>
+              </w:rPr>
+              <w:t xml:space="preserve">4.3%</w:t>
+            </w:r>
+          </w:p>
+        </w:tc>
+        <w:tc>
+          <w:tcPr>
+            <w:tcW w:type="dxa" w:w="1100"/>
             <w:tcBorders>
               <w:top w:val="single" w:color="999999" w:sz="1"/>
               <w:left w:val="single" w:color="999999" w:sz="1"/>
@@ -3496,61 +4000,31 @@
         </w:tc>
         <w:tc>
           <w:tcPr>
-            <w:tcW w:type="dxa" w:w="2200"/>
-            <w:tcBorders>
-              <w:top w:val="single" w:color="999999" w:sz="1"/>
-              <w:left w:val="single" w:color="999999" w:sz="1"/>
-              <w:bottom w:val="single" w:color="999999" w:sz="1"/>
-              <w:right w:val="single" w:color="999999" w:sz="1"/>
-            </w:tcBorders>
-            <w:tcMar>
-              <w:top w:type="dxa" w:w="40"/>
-              <w:left w:type="dxa" w:w="80"/>
-              <w:bottom w:type="dxa" w:w="40"/>
-              <w:right w:type="dxa" w:w="80"/>
-            </w:tcMar>
-          </w:tcPr>
-          <w:p>
-            <w:pPr>
-              <w:jc w:val="left"/>
-            </w:pPr>
-            <w:r>
-              <w:rPr>
-                <w:rFonts w:ascii="Times New Roman" w:cs="Times New Roman" w:eastAsia="Times New Roman" w:hAnsi="Times New Roman"/>
-                <w:sz w:val="18"/>
-                <w:szCs w:val="18"/>
-              </w:rPr>
-              <w:t xml:space="preserve">7.1%</w:t>
-            </w:r>
-          </w:p>
-        </w:tc>
-        <w:tc>
-          <w:tcPr>
-            <w:tcW w:type="dxa" w:w="3160"/>
-            <w:tcBorders>
-              <w:top w:val="single" w:color="999999" w:sz="1"/>
-              <w:left w:val="single" w:color="999999" w:sz="1"/>
-              <w:bottom w:val="single" w:color="999999" w:sz="1"/>
-              <w:right w:val="single" w:color="999999" w:sz="1"/>
-            </w:tcBorders>
-            <w:tcMar>
-              <w:top w:type="dxa" w:w="40"/>
-              <w:left w:type="dxa" w:w="80"/>
-              <w:bottom w:type="dxa" w:w="40"/>
-              <w:right w:type="dxa" w:w="80"/>
-            </w:tcMar>
-          </w:tcPr>
-          <w:p>
-            <w:pPr>
-              <w:jc w:val="left"/>
-            </w:pPr>
-            <w:r>
-              <w:rPr>
-                <w:rFonts w:ascii="Times New Roman" w:cs="Times New Roman" w:eastAsia="Times New Roman" w:hAnsi="Times New Roman"/>
-                <w:sz w:val="18"/>
-                <w:szCs w:val="18"/>
-              </w:rPr>
-              <w:t xml:space="preserve">Mostly easy</w:t>
+            <w:tcW w:type="dxa" w:w="1860"/>
+            <w:tcBorders>
+              <w:top w:val="single" w:color="999999" w:sz="1"/>
+              <w:left w:val="single" w:color="999999" w:sz="1"/>
+              <w:bottom w:val="single" w:color="999999" w:sz="1"/>
+              <w:right w:val="single" w:color="999999" w:sz="1"/>
+            </w:tcBorders>
+            <w:tcMar>
+              <w:top w:type="dxa" w:w="40"/>
+              <w:left w:type="dxa" w:w="80"/>
+              <w:bottom w:type="dxa" w:w="40"/>
+              <w:right w:type="dxa" w:w="80"/>
+            </w:tcMar>
+          </w:tcPr>
+          <w:p>
+            <w:pPr>
+              <w:jc w:val="left"/>
+            </w:pPr>
+            <w:r>
+              <w:rPr>
+                <w:rFonts w:ascii="Times New Roman" w:cs="Times New Roman" w:eastAsia="Times New Roman" w:hAnsi="Times New Roman"/>
+                <w:sz w:val="18"/>
+                <w:szCs w:val="18"/>
+              </w:rPr>
+              <w:t xml:space="preserve">R1 fails, R2 recovers</w:t>
             </w:r>
           </w:p>
         </w:tc>
@@ -3558,37 +4032,157 @@
       <w:tr>
         <w:tc>
           <w:tcPr>
-            <w:tcW w:type="dxa" w:w="2000"/>
-            <w:tcBorders>
-              <w:top w:val="single" w:color="999999" w:sz="1"/>
-              <w:left w:val="single" w:color="999999" w:sz="1"/>
-              <w:bottom w:val="single" w:color="999999" w:sz="1"/>
-              <w:right w:val="single" w:color="999999" w:sz="1"/>
-            </w:tcBorders>
-            <w:tcMar>
-              <w:top w:type="dxa" w:w="40"/>
-              <w:left w:type="dxa" w:w="80"/>
-              <w:bottom w:type="dxa" w:w="40"/>
-              <w:right w:type="dxa" w:w="80"/>
-            </w:tcMar>
-          </w:tcPr>
-          <w:p>
-            <w:pPr>
-              <w:jc w:val="left"/>
-            </w:pPr>
-            <w:r>
-              <w:rPr>
-                <w:rFonts w:ascii="Times New Roman" w:cs="Times New Roman" w:eastAsia="Times New Roman" w:hAnsi="Times New Roman"/>
-                <w:sz w:val="18"/>
-                <w:szCs w:val="18"/>
-              </w:rPr>
-              <w:t xml:space="preserve">productivity</w:t>
-            </w:r>
-          </w:p>
-        </w:tc>
-        <w:tc>
-          <w:tcPr>
-            <w:tcW w:type="dxa" w:w="2000"/>
+            <w:tcW w:type="dxa" w:w="1600"/>
+            <w:tcBorders>
+              <w:top w:val="single" w:color="999999" w:sz="1"/>
+              <w:left w:val="single" w:color="999999" w:sz="1"/>
+              <w:bottom w:val="single" w:color="999999" w:sz="1"/>
+              <w:right w:val="single" w:color="999999" w:sz="1"/>
+            </w:tcBorders>
+            <w:tcMar>
+              <w:top w:type="dxa" w:w="40"/>
+              <w:left w:type="dxa" w:w="80"/>
+              <w:bottom w:type="dxa" w:w="40"/>
+              <w:right w:type="dxa" w:w="80"/>
+            </w:tcMar>
+          </w:tcPr>
+          <w:p>
+            <w:pPr>
+              <w:jc w:val="left"/>
+            </w:pPr>
+            <w:r>
+              <w:rPr>
+                <w:rFonts w:ascii="Times New Roman" w:cs="Times New Roman" w:eastAsia="Times New Roman" w:hAnsi="Times New Roman"/>
+                <w:sz w:val="18"/>
+                <w:szCs w:val="18"/>
+              </w:rPr>
+              <w:t xml:space="preserve">product.</w:t>
+            </w:r>
+          </w:p>
+        </w:tc>
+        <w:tc>
+          <w:tcPr>
+            <w:tcW w:type="dxa" w:w="1200"/>
+            <w:tcBorders>
+              <w:top w:val="single" w:color="999999" w:sz="1"/>
+              <w:left w:val="single" w:color="999999" w:sz="1"/>
+              <w:bottom w:val="single" w:color="999999" w:sz="1"/>
+              <w:right w:val="single" w:color="999999" w:sz="1"/>
+            </w:tcBorders>
+            <w:tcMar>
+              <w:top w:type="dxa" w:w="40"/>
+              <w:left w:type="dxa" w:w="80"/>
+              <w:bottom w:type="dxa" w:w="40"/>
+              <w:right w:type="dxa" w:w="80"/>
+            </w:tcMar>
+          </w:tcPr>
+          <w:p>
+            <w:pPr>
+              <w:jc w:val="left"/>
+            </w:pPr>
+            <w:r>
+              <w:rPr>
+                <w:rFonts w:ascii="Times New Roman" w:cs="Times New Roman" w:eastAsia="Times New Roman" w:hAnsi="Times New Roman"/>
+                <w:sz w:val="18"/>
+                <w:szCs w:val="18"/>
+              </w:rPr>
+              <w:t xml:space="preserve">32</w:t>
+            </w:r>
+          </w:p>
+        </w:tc>
+        <w:tc>
+          <w:tcPr>
+            <w:tcW w:type="dxa" w:w="1200"/>
+            <w:tcBorders>
+              <w:top w:val="single" w:color="999999" w:sz="1"/>
+              <w:left w:val="single" w:color="999999" w:sz="1"/>
+              <w:bottom w:val="single" w:color="999999" w:sz="1"/>
+              <w:right w:val="single" w:color="999999" w:sz="1"/>
+            </w:tcBorders>
+            <w:tcMar>
+              <w:top w:type="dxa" w:w="40"/>
+              <w:left w:type="dxa" w:w="80"/>
+              <w:bottom w:type="dxa" w:w="40"/>
+              <w:right w:type="dxa" w:w="80"/>
+            </w:tcMar>
+          </w:tcPr>
+          <w:p>
+            <w:pPr>
+              <w:jc w:val="left"/>
+            </w:pPr>
+            <w:r>
+              <w:rPr>
+                <w:rFonts w:ascii="Times New Roman" w:cs="Times New Roman" w:eastAsia="Times New Roman" w:hAnsi="Times New Roman"/>
+                <w:sz w:val="18"/>
+                <w:szCs w:val="18"/>
+              </w:rPr>
+              <w:t xml:space="preserve">12.5%</w:t>
+            </w:r>
+          </w:p>
+        </w:tc>
+        <w:tc>
+          <w:tcPr>
+            <w:tcW w:type="dxa" w:w="1200"/>
+            <w:tcBorders>
+              <w:top w:val="single" w:color="999999" w:sz="1"/>
+              <w:left w:val="single" w:color="999999" w:sz="1"/>
+              <w:bottom w:val="single" w:color="999999" w:sz="1"/>
+              <w:right w:val="single" w:color="999999" w:sz="1"/>
+            </w:tcBorders>
+            <w:tcMar>
+              <w:top w:type="dxa" w:w="40"/>
+              <w:left w:type="dxa" w:w="80"/>
+              <w:bottom w:type="dxa" w:w="40"/>
+              <w:right w:type="dxa" w:w="80"/>
+            </w:tcMar>
+          </w:tcPr>
+          <w:p>
+            <w:pPr>
+              <w:jc w:val="left"/>
+            </w:pPr>
+            <w:r>
+              <w:rPr>
+                <w:rFonts w:ascii="Times New Roman" w:cs="Times New Roman" w:eastAsia="Times New Roman" w:hAnsi="Times New Roman"/>
+                <w:sz w:val="18"/>
+                <w:szCs w:val="18"/>
+              </w:rPr>
+              <w:t xml:space="preserve">9</w:t>
+            </w:r>
+          </w:p>
+        </w:tc>
+        <w:tc>
+          <w:tcPr>
+            <w:tcW w:type="dxa" w:w="1200"/>
+            <w:tcBorders>
+              <w:top w:val="single" w:color="999999" w:sz="1"/>
+              <w:left w:val="single" w:color="999999" w:sz="1"/>
+              <w:bottom w:val="single" w:color="999999" w:sz="1"/>
+              <w:right w:val="single" w:color="999999" w:sz="1"/>
+            </w:tcBorders>
+            <w:tcMar>
+              <w:top w:type="dxa" w:w="40"/>
+              <w:left w:type="dxa" w:w="80"/>
+              <w:bottom w:type="dxa" w:w="40"/>
+              <w:right w:type="dxa" w:w="80"/>
+            </w:tcMar>
+          </w:tcPr>
+          <w:p>
+            <w:pPr>
+              <w:jc w:val="left"/>
+            </w:pPr>
+            <w:r>
+              <w:rPr>
+                <w:rFonts w:ascii="Times New Roman" w:cs="Times New Roman" w:eastAsia="Times New Roman" w:hAnsi="Times New Roman"/>
+                <w:sz w:val="18"/>
+                <w:szCs w:val="18"/>
+              </w:rPr>
+              <w:t xml:space="preserve">22.2%</w:t>
+            </w:r>
+          </w:p>
+        </w:tc>
+        <w:tc>
+          <w:tcPr>
+            <w:tcW w:type="dxa" w:w="1100"/>
             <w:tcBorders>
               <w:top w:val="single" w:color="999999" w:sz="1"/>
               <w:left w:val="single" w:color="999999" w:sz="1"/>
@@ -3618,61 +4212,31 @@
         </w:tc>
         <w:tc>
           <w:tcPr>
-            <w:tcW w:type="dxa" w:w="2200"/>
-            <w:tcBorders>
-              <w:top w:val="single" w:color="999999" w:sz="1"/>
-              <w:left w:val="single" w:color="999999" w:sz="1"/>
-              <w:bottom w:val="single" w:color="999999" w:sz="1"/>
-              <w:right w:val="single" w:color="999999" w:sz="1"/>
-            </w:tcBorders>
-            <w:tcMar>
-              <w:top w:type="dxa" w:w="40"/>
-              <w:left w:type="dxa" w:w="80"/>
-              <w:bottom w:type="dxa" w:w="40"/>
-              <w:right w:type="dxa" w:w="80"/>
-            </w:tcMar>
-          </w:tcPr>
-          <w:p>
-            <w:pPr>
-              <w:jc w:val="left"/>
-            </w:pPr>
-            <w:r>
-              <w:rPr>
-                <w:rFonts w:ascii="Times New Roman" w:cs="Times New Roman" w:eastAsia="Times New Roman" w:hAnsi="Times New Roman"/>
-                <w:sz w:val="18"/>
-                <w:szCs w:val="18"/>
-              </w:rPr>
-              <w:t xml:space="preserve">11.8%</w:t>
-            </w:r>
-          </w:p>
-        </w:tc>
-        <w:tc>
-          <w:tcPr>
-            <w:tcW w:type="dxa" w:w="3160"/>
-            <w:tcBorders>
-              <w:top w:val="single" w:color="999999" w:sz="1"/>
-              <w:left w:val="single" w:color="999999" w:sz="1"/>
-              <w:bottom w:val="single" w:color="999999" w:sz="1"/>
-              <w:right w:val="single" w:color="999999" w:sz="1"/>
-            </w:tcBorders>
-            <w:tcMar>
-              <w:top w:type="dxa" w:w="40"/>
-              <w:left w:type="dxa" w:w="80"/>
-              <w:bottom w:type="dxa" w:w="40"/>
-              <w:right w:type="dxa" w:w="80"/>
-            </w:tcMar>
-          </w:tcPr>
-          <w:p>
-            <w:pPr>
-              <w:jc w:val="left"/>
-            </w:pPr>
-            <w:r>
-              <w:rPr>
-                <w:rFonts w:ascii="Times New Roman" w:cs="Times New Roman" w:eastAsia="Times New Roman" w:hAnsi="Times New Roman"/>
-                <w:sz w:val="18"/>
-                <w:szCs w:val="18"/>
-              </w:rPr>
-              <w:t xml:space="preserve">Moderate: shared verbs</w:t>
+            <w:tcW w:type="dxa" w:w="1860"/>
+            <w:tcBorders>
+              <w:top w:val="single" w:color="999999" w:sz="1"/>
+              <w:left w:val="single" w:color="999999" w:sz="1"/>
+              <w:bottom w:val="single" w:color="999999" w:sz="1"/>
+              <w:right w:val="single" w:color="999999" w:sz="1"/>
+            </w:tcBorders>
+            <w:tcMar>
+              <w:top w:type="dxa" w:w="40"/>
+              <w:left w:type="dxa" w:w="80"/>
+              <w:bottom w:type="dxa" w:w="40"/>
+              <w:right w:type="dxa" w:w="80"/>
+            </w:tcMar>
+          </w:tcPr>
+          <w:p>
+            <w:pPr>
+              <w:jc w:val="left"/>
+            </w:pPr>
+            <w:r>
+              <w:rPr>
+                <w:rFonts w:ascii="Times New Roman" w:cs="Times New Roman" w:eastAsia="Times New Roman" w:hAnsi="Times New Roman"/>
+                <w:sz w:val="18"/>
+                <w:szCs w:val="18"/>
+              </w:rPr>
+              <w:t xml:space="preserve">Abstract task verbs</w:t>
             </w:r>
           </w:p>
         </w:tc>
@@ -3680,121 +4244,211 @@
       <w:tr>
         <w:tc>
           <w:tcPr>
-            <w:tcW w:type="dxa" w:w="2000"/>
-            <w:tcBorders>
-              <w:top w:val="single" w:color="999999" w:sz="1"/>
-              <w:left w:val="single" w:color="999999" w:sz="1"/>
-              <w:bottom w:val="single" w:color="999999" w:sz="1"/>
-              <w:right w:val="single" w:color="999999" w:sz="1"/>
-            </w:tcBorders>
-            <w:tcMar>
-              <w:top w:type="dxa" w:w="40"/>
-              <w:left w:type="dxa" w:w="80"/>
-              <w:bottom w:type="dxa" w:w="40"/>
-              <w:right w:type="dxa" w:w="80"/>
-            </w:tcMar>
-          </w:tcPr>
-          <w:p>
-            <w:pPr>
-              <w:jc w:val="left"/>
-            </w:pPr>
-            <w:r>
-              <w:rPr>
-                <w:rFonts w:ascii="Times New Roman" w:cs="Times New Roman" w:eastAsia="Times New Roman" w:hAnsi="Times New Roman"/>
-                <w:sz w:val="18"/>
-                <w:szCs w:val="18"/>
-              </w:rPr>
-              <w:t xml:space="preserve">device</w:t>
-            </w:r>
-          </w:p>
-        </w:tc>
-        <w:tc>
-          <w:tcPr>
-            <w:tcW w:type="dxa" w:w="2000"/>
-            <w:tcBorders>
-              <w:top w:val="single" w:color="999999" w:sz="1"/>
-              <w:left w:val="single" w:color="999999" w:sz="1"/>
-              <w:bottom w:val="single" w:color="999999" w:sz="1"/>
-              <w:right w:val="single" w:color="999999" w:sz="1"/>
-            </w:tcBorders>
-            <w:tcMar>
-              <w:top w:type="dxa" w:w="40"/>
-              <w:left w:type="dxa" w:w="80"/>
-              <w:bottom w:type="dxa" w:w="40"/>
-              <w:right w:type="dxa" w:w="80"/>
-            </w:tcMar>
-          </w:tcPr>
-          <w:p>
-            <w:pPr>
-              <w:jc w:val="left"/>
-            </w:pPr>
-            <w:r>
-              <w:rPr>
-                <w:rFonts w:ascii="Times New Roman" w:cs="Times New Roman" w:eastAsia="Times New Roman" w:hAnsi="Times New Roman"/>
-                <w:sz w:val="18"/>
-                <w:szCs w:val="18"/>
-              </w:rPr>
-              <w:t xml:space="preserve">22.0%</w:t>
-            </w:r>
-          </w:p>
-        </w:tc>
-        <w:tc>
-          <w:tcPr>
-            <w:tcW w:type="dxa" w:w="2200"/>
-            <w:tcBorders>
-              <w:top w:val="single" w:color="999999" w:sz="1"/>
-              <w:left w:val="single" w:color="999999" w:sz="1"/>
-              <w:bottom w:val="single" w:color="999999" w:sz="1"/>
-              <w:right w:val="single" w:color="999999" w:sz="1"/>
-            </w:tcBorders>
-            <w:tcMar>
-              <w:top w:type="dxa" w:w="40"/>
-              <w:left w:type="dxa" w:w="80"/>
-              <w:bottom w:type="dxa" w:w="40"/>
-              <w:right w:type="dxa" w:w="80"/>
-            </w:tcMar>
-          </w:tcPr>
-          <w:p>
-            <w:pPr>
-              <w:jc w:val="left"/>
-            </w:pPr>
-            <w:r>
-              <w:rPr>
-                <w:rFonts w:ascii="Times New Roman" w:cs="Times New Roman" w:eastAsia="Times New Roman" w:hAnsi="Times New Roman"/>
-                <w:sz w:val="18"/>
-                <w:szCs w:val="18"/>
-              </w:rPr>
-              <w:t xml:space="preserve">25.0%</w:t>
-            </w:r>
-          </w:p>
-        </w:tc>
-        <w:tc>
-          <w:tcPr>
-            <w:tcW w:type="dxa" w:w="3160"/>
-            <w:tcBorders>
-              <w:top w:val="single" w:color="999999" w:sz="1"/>
-              <w:left w:val="single" w:color="999999" w:sz="1"/>
-              <w:bottom w:val="single" w:color="999999" w:sz="1"/>
-              <w:right w:val="single" w:color="999999" w:sz="1"/>
-            </w:tcBorders>
-            <w:tcMar>
-              <w:top w:type="dxa" w:w="40"/>
-              <w:left w:type="dxa" w:w="80"/>
-              <w:bottom w:type="dxa" w:w="40"/>
-              <w:right w:type="dxa" w:w="80"/>
-            </w:tcMar>
-          </w:tcPr>
-          <w:p>
-            <w:pPr>
-              <w:jc w:val="left"/>
-            </w:pPr>
-            <w:r>
-              <w:rPr>
-                <w:rFonts w:ascii="Times New Roman" w:cs="Times New Roman" w:eastAsia="Times New Roman" w:hAnsi="Times New Roman"/>
-                <w:sz w:val="18"/>
-                <w:szCs w:val="18"/>
-              </w:rPr>
-              <w:t xml:space="preserve">Hard: polysemous commands</w:t>
+            <w:tcW w:type="dxa" w:w="1600"/>
+            <w:tcBorders>
+              <w:top w:val="single" w:color="999999" w:sz="1"/>
+              <w:left w:val="single" w:color="999999" w:sz="1"/>
+              <w:bottom w:val="single" w:color="999999" w:sz="1"/>
+              <w:right w:val="single" w:color="999999" w:sz="1"/>
+            </w:tcBorders>
+            <w:tcMar>
+              <w:top w:type="dxa" w:w="40"/>
+              <w:left w:type="dxa" w:w="80"/>
+              <w:bottom w:type="dxa" w:w="40"/>
+              <w:right w:type="dxa" w:w="80"/>
+            </w:tcMar>
+          </w:tcPr>
+          <w:p>
+            <w:pPr>
+              <w:jc w:val="left"/>
+            </w:pPr>
+            <w:r>
+              <w:rPr>
+                <w:rFonts w:ascii="Times New Roman" w:cs="Times New Roman" w:eastAsia="Times New Roman" w:hAnsi="Times New Roman"/>
+                <w:sz w:val="18"/>
+                <w:szCs w:val="18"/>
+              </w:rPr>
+              <w:t xml:space="preserve">travel</w:t>
+            </w:r>
+          </w:p>
+        </w:tc>
+        <w:tc>
+          <w:tcPr>
+            <w:tcW w:type="dxa" w:w="1200"/>
+            <w:tcBorders>
+              <w:top w:val="single" w:color="999999" w:sz="1"/>
+              <w:left w:val="single" w:color="999999" w:sz="1"/>
+              <w:bottom w:val="single" w:color="999999" w:sz="1"/>
+              <w:right w:val="single" w:color="999999" w:sz="1"/>
+            </w:tcBorders>
+            <w:tcMar>
+              <w:top w:type="dxa" w:w="40"/>
+              <w:left w:type="dxa" w:w="80"/>
+              <w:bottom w:type="dxa" w:w="40"/>
+              <w:right w:type="dxa" w:w="80"/>
+            </w:tcMar>
+          </w:tcPr>
+          <w:p>
+            <w:pPr>
+              <w:jc w:val="left"/>
+            </w:pPr>
+            <w:r>
+              <w:rPr>
+                <w:rFonts w:ascii="Times New Roman" w:cs="Times New Roman" w:eastAsia="Times New Roman" w:hAnsi="Times New Roman"/>
+                <w:sz w:val="18"/>
+                <w:szCs w:val="18"/>
+              </w:rPr>
+              <w:t xml:space="preserve">38</w:t>
+            </w:r>
+          </w:p>
+        </w:tc>
+        <w:tc>
+          <w:tcPr>
+            <w:tcW w:type="dxa" w:w="1200"/>
+            <w:tcBorders>
+              <w:top w:val="single" w:color="999999" w:sz="1"/>
+              <w:left w:val="single" w:color="999999" w:sz="1"/>
+              <w:bottom w:val="single" w:color="999999" w:sz="1"/>
+              <w:right w:val="single" w:color="999999" w:sz="1"/>
+            </w:tcBorders>
+            <w:tcMar>
+              <w:top w:type="dxa" w:w="40"/>
+              <w:left w:type="dxa" w:w="80"/>
+              <w:bottom w:type="dxa" w:w="40"/>
+              <w:right w:type="dxa" w:w="80"/>
+            </w:tcMar>
+          </w:tcPr>
+          <w:p>
+            <w:pPr>
+              <w:jc w:val="left"/>
+            </w:pPr>
+            <w:r>
+              <w:rPr>
+                <w:rFonts w:ascii="Times New Roman" w:cs="Times New Roman" w:eastAsia="Times New Roman" w:hAnsi="Times New Roman"/>
+                <w:sz w:val="18"/>
+                <w:szCs w:val="18"/>
+              </w:rPr>
+              <w:t xml:space="preserve">5.3%</w:t>
+            </w:r>
+          </w:p>
+        </w:tc>
+        <w:tc>
+          <w:tcPr>
+            <w:tcW w:type="dxa" w:w="1200"/>
+            <w:tcBorders>
+              <w:top w:val="single" w:color="999999" w:sz="1"/>
+              <w:left w:val="single" w:color="999999" w:sz="1"/>
+              <w:bottom w:val="single" w:color="999999" w:sz="1"/>
+              <w:right w:val="single" w:color="999999" w:sz="1"/>
+            </w:tcBorders>
+            <w:tcMar>
+              <w:top w:type="dxa" w:w="40"/>
+              <w:left w:type="dxa" w:w="80"/>
+              <w:bottom w:type="dxa" w:w="40"/>
+              <w:right w:type="dxa" w:w="80"/>
+            </w:tcMar>
+          </w:tcPr>
+          <w:p>
+            <w:pPr>
+              <w:jc w:val="left"/>
+            </w:pPr>
+            <w:r>
+              <w:rPr>
+                <w:rFonts w:ascii="Times New Roman" w:cs="Times New Roman" w:eastAsia="Times New Roman" w:hAnsi="Times New Roman"/>
+                <w:sz w:val="18"/>
+                <w:szCs w:val="18"/>
+              </w:rPr>
+              <w:t xml:space="preserve">3</w:t>
+            </w:r>
+          </w:p>
+        </w:tc>
+        <w:tc>
+          <w:tcPr>
+            <w:tcW w:type="dxa" w:w="1200"/>
+            <w:tcBorders>
+              <w:top w:val="single" w:color="999999" w:sz="1"/>
+              <w:left w:val="single" w:color="999999" w:sz="1"/>
+              <w:bottom w:val="single" w:color="999999" w:sz="1"/>
+              <w:right w:val="single" w:color="999999" w:sz="1"/>
+            </w:tcBorders>
+            <w:tcMar>
+              <w:top w:type="dxa" w:w="40"/>
+              <w:left w:type="dxa" w:w="80"/>
+              <w:bottom w:type="dxa" w:w="40"/>
+              <w:right w:type="dxa" w:w="80"/>
+            </w:tcMar>
+          </w:tcPr>
+          <w:p>
+            <w:pPr>
+              <w:jc w:val="left"/>
+            </w:pPr>
+            <w:r>
+              <w:rPr>
+                <w:rFonts w:ascii="Times New Roman" w:cs="Times New Roman" w:eastAsia="Times New Roman" w:hAnsi="Times New Roman"/>
+                <w:sz w:val="18"/>
+                <w:szCs w:val="18"/>
+              </w:rPr>
+              <w:t xml:space="preserve">33.3%</w:t>
+            </w:r>
+          </w:p>
+        </w:tc>
+        <w:tc>
+          <w:tcPr>
+            <w:tcW w:type="dxa" w:w="1100"/>
+            <w:tcBorders>
+              <w:top w:val="single" w:color="999999" w:sz="1"/>
+              <w:left w:val="single" w:color="999999" w:sz="1"/>
+              <w:bottom w:val="single" w:color="999999" w:sz="1"/>
+              <w:right w:val="single" w:color="999999" w:sz="1"/>
+            </w:tcBorders>
+            <w:tcMar>
+              <w:top w:type="dxa" w:w="40"/>
+              <w:left w:type="dxa" w:w="80"/>
+              <w:bottom w:type="dxa" w:w="40"/>
+              <w:right w:type="dxa" w:w="80"/>
+            </w:tcMar>
+          </w:tcPr>
+          <w:p>
+            <w:pPr>
+              <w:jc w:val="left"/>
+            </w:pPr>
+            <w:r>
+              <w:rPr>
+                <w:rFonts w:ascii="Times New Roman" w:cs="Times New Roman" w:eastAsia="Times New Roman" w:hAnsi="Times New Roman"/>
+                <w:sz w:val="18"/>
+                <w:szCs w:val="18"/>
+              </w:rPr>
+              <w:t xml:space="preserve">18.0%</w:t>
+            </w:r>
+          </w:p>
+        </w:tc>
+        <w:tc>
+          <w:tcPr>
+            <w:tcW w:type="dxa" w:w="1860"/>
+            <w:tcBorders>
+              <w:top w:val="single" w:color="999999" w:sz="1"/>
+              <w:left w:val="single" w:color="999999" w:sz="1"/>
+              <w:bottom w:val="single" w:color="999999" w:sz="1"/>
+              <w:right w:val="single" w:color="999999" w:sz="1"/>
+            </w:tcBorders>
+            <w:tcMar>
+              <w:top w:type="dxa" w:w="40"/>
+              <w:left w:type="dxa" w:w="80"/>
+              <w:bottom w:type="dxa" w:w="40"/>
+              <w:right w:type="dxa" w:w="80"/>
+            </w:tcMar>
+          </w:tcPr>
+          <w:p>
+            <w:pPr>
+              <w:jc w:val="left"/>
+            </w:pPr>
+            <w:r>
+              <w:rPr>
+                <w:rFonts w:ascii="Times New Roman" w:cs="Times New Roman" w:eastAsia="Times New Roman" w:hAnsi="Times New Roman"/>
+                <w:sz w:val="18"/>
+                <w:szCs w:val="18"/>
+              </w:rPr>
+              <w:t xml:space="preserve">Few R2 stops</w:t>
             </w:r>
           </w:p>
         </w:tc>
@@ -3802,7 +4456,7 @@
       <w:tr>
         <w:tc>
           <w:tcPr>
-            <w:tcW w:type="dxa" w:w="2000"/>
+            <w:tcW w:type="dxa" w:w="1600"/>
             <w:tcBorders>
               <w:top w:val="single" w:color="999999" w:sz="1"/>
               <w:left w:val="single" w:color="999999" w:sz="1"/>
@@ -3832,7 +4486,127 @@
         </w:tc>
         <w:tc>
           <w:tcPr>
-            <w:tcW w:type="dxa" w:w="2000"/>
+            <w:tcW w:type="dxa" w:w="1200"/>
+            <w:tcBorders>
+              <w:top w:val="single" w:color="999999" w:sz="1"/>
+              <w:left w:val="single" w:color="999999" w:sz="1"/>
+              <w:bottom w:val="single" w:color="999999" w:sz="1"/>
+              <w:right w:val="single" w:color="999999" w:sz="1"/>
+            </w:tcBorders>
+            <w:tcMar>
+              <w:top w:type="dxa" w:w="40"/>
+              <w:left w:type="dxa" w:w="80"/>
+              <w:bottom w:type="dxa" w:w="40"/>
+              <w:right w:type="dxa" w:w="80"/>
+            </w:tcMar>
+          </w:tcPr>
+          <w:p>
+            <w:pPr>
+              <w:jc w:val="left"/>
+            </w:pPr>
+            <w:r>
+              <w:rPr>
+                <w:rFonts w:ascii="Times New Roman" w:cs="Times New Roman" w:eastAsia="Times New Roman" w:hAnsi="Times New Roman"/>
+                <w:sz w:val="18"/>
+                <w:szCs w:val="18"/>
+              </w:rPr>
+              <w:t xml:space="preserve">18</w:t>
+            </w:r>
+          </w:p>
+        </w:tc>
+        <w:tc>
+          <w:tcPr>
+            <w:tcW w:type="dxa" w:w="1200"/>
+            <w:tcBorders>
+              <w:top w:val="single" w:color="999999" w:sz="1"/>
+              <w:left w:val="single" w:color="999999" w:sz="1"/>
+              <w:bottom w:val="single" w:color="999999" w:sz="1"/>
+              <w:right w:val="single" w:color="999999" w:sz="1"/>
+            </w:tcBorders>
+            <w:tcMar>
+              <w:top w:type="dxa" w:w="40"/>
+              <w:left w:type="dxa" w:w="80"/>
+              <w:bottom w:type="dxa" w:w="40"/>
+              <w:right w:type="dxa" w:w="80"/>
+            </w:tcMar>
+          </w:tcPr>
+          <w:p>
+            <w:pPr>
+              <w:jc w:val="left"/>
+            </w:pPr>
+            <w:r>
+              <w:rPr>
+                <w:rFonts w:ascii="Times New Roman" w:cs="Times New Roman" w:eastAsia="Times New Roman" w:hAnsi="Times New Roman"/>
+                <w:sz w:val="18"/>
+                <w:szCs w:val="18"/>
+              </w:rPr>
+              <w:t xml:space="preserve">11.1%</w:t>
+            </w:r>
+          </w:p>
+        </w:tc>
+        <w:tc>
+          <w:tcPr>
+            <w:tcW w:type="dxa" w:w="1200"/>
+            <w:tcBorders>
+              <w:top w:val="single" w:color="999999" w:sz="1"/>
+              <w:left w:val="single" w:color="999999" w:sz="1"/>
+              <w:bottom w:val="single" w:color="999999" w:sz="1"/>
+              <w:right w:val="single" w:color="999999" w:sz="1"/>
+            </w:tcBorders>
+            <w:tcMar>
+              <w:top w:type="dxa" w:w="40"/>
+              <w:left w:type="dxa" w:w="80"/>
+              <w:bottom w:type="dxa" w:w="40"/>
+              <w:right w:type="dxa" w:w="80"/>
+            </w:tcMar>
+          </w:tcPr>
+          <w:p>
+            <w:pPr>
+              <w:jc w:val="left"/>
+            </w:pPr>
+            <w:r>
+              <w:rPr>
+                <w:rFonts w:ascii="Times New Roman" w:cs="Times New Roman" w:eastAsia="Times New Roman" w:hAnsi="Times New Roman"/>
+                <w:sz w:val="18"/>
+                <w:szCs w:val="18"/>
+              </w:rPr>
+              <w:t xml:space="preserve">11</w:t>
+            </w:r>
+          </w:p>
+        </w:tc>
+        <w:tc>
+          <w:tcPr>
+            <w:tcW w:type="dxa" w:w="1200"/>
+            <w:tcBorders>
+              <w:top w:val="single" w:color="999999" w:sz="1"/>
+              <w:left w:val="single" w:color="999999" w:sz="1"/>
+              <w:bottom w:val="single" w:color="999999" w:sz="1"/>
+              <w:right w:val="single" w:color="999999" w:sz="1"/>
+            </w:tcBorders>
+            <w:tcMar>
+              <w:top w:type="dxa" w:w="40"/>
+              <w:left w:type="dxa" w:w="80"/>
+              <w:bottom w:type="dxa" w:w="40"/>
+              <w:right w:type="dxa" w:w="80"/>
+            </w:tcMar>
+          </w:tcPr>
+          <w:p>
+            <w:pPr>
+              <w:jc w:val="left"/>
+            </w:pPr>
+            <w:r>
+              <w:rPr>
+                <w:rFonts w:ascii="Times New Roman" w:cs="Times New Roman" w:eastAsia="Times New Roman" w:hAnsi="Times New Roman"/>
+                <w:sz w:val="18"/>
+                <w:szCs w:val="18"/>
+              </w:rPr>
+              <w:t xml:space="preserve">9.1%</w:t>
+            </w:r>
+          </w:p>
+        </w:tc>
+        <w:tc>
+          <w:tcPr>
+            <w:tcW w:type="dxa" w:w="1100"/>
             <w:tcBorders>
               <w:top w:val="single" w:color="999999" w:sz="1"/>
               <w:left w:val="single" w:color="999999" w:sz="1"/>
@@ -3862,61 +4636,31 @@
         </w:tc>
         <w:tc>
           <w:tcPr>
-            <w:tcW w:type="dxa" w:w="2200"/>
-            <w:tcBorders>
-              <w:top w:val="single" w:color="999999" w:sz="1"/>
-              <w:left w:val="single" w:color="999999" w:sz="1"/>
-              <w:bottom w:val="single" w:color="999999" w:sz="1"/>
-              <w:right w:val="single" w:color="999999" w:sz="1"/>
-            </w:tcBorders>
-            <w:tcMar>
-              <w:top w:type="dxa" w:w="40"/>
-              <w:left w:type="dxa" w:w="80"/>
-              <w:bottom w:type="dxa" w:w="40"/>
-              <w:right w:type="dxa" w:w="80"/>
-            </w:tcMar>
-          </w:tcPr>
-          <w:p>
-            <w:pPr>
-              <w:jc w:val="left"/>
-            </w:pPr>
-            <w:r>
-              <w:rPr>
-                <w:rFonts w:ascii="Times New Roman" w:cs="Times New Roman" w:eastAsia="Times New Roman" w:hAnsi="Times New Roman"/>
-                <w:sz w:val="18"/>
-                <w:szCs w:val="18"/>
-              </w:rPr>
-              <w:t xml:space="preserve">13.3%</w:t>
-            </w:r>
-          </w:p>
-        </w:tc>
-        <w:tc>
-          <w:tcPr>
-            <w:tcW w:type="dxa" w:w="3160"/>
-            <w:tcBorders>
-              <w:top w:val="single" w:color="999999" w:sz="1"/>
-              <w:left w:val="single" w:color="999999" w:sz="1"/>
-              <w:bottom w:val="single" w:color="999999" w:sz="1"/>
-              <w:right w:val="single" w:color="999999" w:sz="1"/>
-            </w:tcBorders>
-            <w:tcMar>
-              <w:top w:type="dxa" w:w="40"/>
-              <w:left w:type="dxa" w:w="80"/>
-              <w:bottom w:type="dxa" w:w="40"/>
-              <w:right w:type="dxa" w:w="80"/>
-            </w:tcMar>
-          </w:tcPr>
-          <w:p>
-            <w:pPr>
-              <w:jc w:val="left"/>
-            </w:pPr>
-            <w:r>
-              <w:rPr>
-                <w:rFonts w:ascii="Times New Roman" w:cs="Times New Roman" w:eastAsia="Times New Roman" w:hAnsi="Times New Roman"/>
-                <w:sz w:val="18"/>
-                <w:szCs w:val="18"/>
-              </w:rPr>
-              <w:t xml:space="preserve">Hard: conversational</w:t>
+            <w:tcW w:type="dxa" w:w="1860"/>
+            <w:tcBorders>
+              <w:top w:val="single" w:color="999999" w:sz="1"/>
+              <w:left w:val="single" w:color="999999" w:sz="1"/>
+              <w:bottom w:val="single" w:color="999999" w:sz="1"/>
+              <w:right w:val="single" w:color="999999" w:sz="1"/>
+            </w:tcBorders>
+            <w:tcMar>
+              <w:top w:type="dxa" w:w="40"/>
+              <w:left w:type="dxa" w:w="80"/>
+              <w:bottom w:type="dxa" w:w="40"/>
+              <w:right w:type="dxa" w:w="80"/>
+            </w:tcMar>
+          </w:tcPr>
+          <w:p>
+            <w:pPr>
+              <w:jc w:val="left"/>
+            </w:pPr>
+            <w:r>
+              <w:rPr>
+                <w:rFonts w:ascii="Times New Roman" w:cs="Times New Roman" w:eastAsia="Times New Roman" w:hAnsi="Times New Roman"/>
+                <w:sz w:val="18"/>
+                <w:szCs w:val="18"/>
+              </w:rPr>
+              <w:t xml:space="preserve">Conversational</w:t>
             </w:r>
           </w:p>
         </w:tc>
@@ -3924,7 +4668,7 @@
       <w:tr>
         <w:tc>
           <w:tcPr>
-            <w:tcW w:type="dxa" w:w="2000"/>
+            <w:tcW w:type="dxa" w:w="1600"/>
             <w:tcBorders>
               <w:top w:val="single" w:color="999999" w:sz="1"/>
               <w:left w:val="single" w:color="999999" w:sz="1"/>
@@ -3956,7 +4700,7 @@
         </w:tc>
         <w:tc>
           <w:tcPr>
-            <w:tcW w:type="dxa" w:w="2000"/>
+            <w:tcW w:type="dxa" w:w="1200"/>
             <w:tcBorders>
               <w:top w:val="single" w:color="999999" w:sz="1"/>
               <w:left w:val="single" w:color="999999" w:sz="1"/>
@@ -3982,13 +4726,13 @@
                 <w:sz w:val="18"/>
                 <w:szCs w:val="18"/>
               </w:rPr>
-              <w:t xml:space="preserve">64.0%</w:t>
-            </w:r>
-          </w:p>
-        </w:tc>
-        <w:tc>
-          <w:tcPr>
-            <w:tcW w:type="dxa" w:w="2200"/>
+              <w:t xml:space="preserve">7</w:t>
+            </w:r>
+          </w:p>
+        </w:tc>
+        <w:tc>
+          <w:tcPr>
+            <w:tcW w:type="dxa" w:w="1200"/>
             <w:tcBorders>
               <w:top w:val="single" w:color="999999" w:sz="1"/>
               <w:left w:val="single" w:color="999999" w:sz="1"/>
@@ -4014,13 +4758,13 @@
                 <w:sz w:val="18"/>
                 <w:szCs w:val="18"/>
               </w:rPr>
-              <w:t xml:space="preserve">100.0%</w:t>
-            </w:r>
-          </w:p>
-        </w:tc>
-        <w:tc>
-          <w:tcPr>
-            <w:tcW w:type="dxa" w:w="3160"/>
+              <w:t xml:space="preserve">100%</w:t>
+            </w:r>
+          </w:p>
+        </w:tc>
+        <w:tc>
+          <w:tcPr>
+            <w:tcW w:type="dxa" w:w="1200"/>
             <w:tcBorders>
               <w:top w:val="single" w:color="999999" w:sz="1"/>
               <w:left w:val="single" w:color="999999" w:sz="1"/>
@@ -4046,7 +4790,103 @@
                 <w:sz w:val="18"/>
                 <w:szCs w:val="18"/>
               </w:rPr>
-              <w:t xml:space="preserve">Hardest: correctly escalated</w:t>
+              <w:t xml:space="preserve">9</w:t>
+            </w:r>
+          </w:p>
+        </w:tc>
+        <w:tc>
+          <w:tcPr>
+            <w:tcW w:type="dxa" w:w="1200"/>
+            <w:tcBorders>
+              <w:top w:val="single" w:color="999999" w:sz="1"/>
+              <w:left w:val="single" w:color="999999" w:sz="1"/>
+              <w:bottom w:val="single" w:color="999999" w:sz="1"/>
+              <w:right w:val="single" w:color="999999" w:sz="1"/>
+            </w:tcBorders>
+            <w:tcMar>
+              <w:top w:type="dxa" w:w="40"/>
+              <w:left w:type="dxa" w:w="80"/>
+              <w:bottom w:type="dxa" w:w="40"/>
+              <w:right w:type="dxa" w:w="80"/>
+            </w:tcMar>
+          </w:tcPr>
+          <w:p>
+            <w:pPr>
+              <w:jc w:val="left"/>
+            </w:pPr>
+            <w:r>
+              <w:rPr>
+                <w:rFonts w:ascii="Times New Roman" w:cs="Times New Roman" w:eastAsia="Times New Roman" w:hAnsi="Times New Roman"/>
+                <w:b/>
+                <w:bCs/>
+                <w:sz w:val="18"/>
+                <w:szCs w:val="18"/>
+              </w:rPr>
+              <w:t xml:space="preserve">55.6%</w:t>
+            </w:r>
+          </w:p>
+        </w:tc>
+        <w:tc>
+          <w:tcPr>
+            <w:tcW w:type="dxa" w:w="1100"/>
+            <w:tcBorders>
+              <w:top w:val="single" w:color="999999" w:sz="1"/>
+              <w:left w:val="single" w:color="999999" w:sz="1"/>
+              <w:bottom w:val="single" w:color="999999" w:sz="1"/>
+              <w:right w:val="single" w:color="999999" w:sz="1"/>
+            </w:tcBorders>
+            <w:tcMar>
+              <w:top w:type="dxa" w:w="40"/>
+              <w:left w:type="dxa" w:w="80"/>
+              <w:bottom w:type="dxa" w:w="40"/>
+              <w:right w:type="dxa" w:w="80"/>
+            </w:tcMar>
+          </w:tcPr>
+          <w:p>
+            <w:pPr>
+              <w:jc w:val="left"/>
+            </w:pPr>
+            <w:r>
+              <w:rPr>
+                <w:rFonts w:ascii="Times New Roman" w:cs="Times New Roman" w:eastAsia="Times New Roman" w:hAnsi="Times New Roman"/>
+                <w:b/>
+                <w:bCs/>
+                <w:sz w:val="18"/>
+                <w:szCs w:val="18"/>
+              </w:rPr>
+              <w:t xml:space="preserve">68.0%</w:t>
+            </w:r>
+          </w:p>
+        </w:tc>
+        <w:tc>
+          <w:tcPr>
+            <w:tcW w:type="dxa" w:w="1860"/>
+            <w:tcBorders>
+              <w:top w:val="single" w:color="999999" w:sz="1"/>
+              <w:left w:val="single" w:color="999999" w:sz="1"/>
+              <w:bottom w:val="single" w:color="999999" w:sz="1"/>
+              <w:right w:val="single" w:color="999999" w:sz="1"/>
+            </w:tcBorders>
+            <w:tcMar>
+              <w:top w:type="dxa" w:w="40"/>
+              <w:left w:type="dxa" w:w="80"/>
+              <w:bottom w:type="dxa" w:w="40"/>
+              <w:right w:type="dxa" w:w="80"/>
+            </w:tcMar>
+          </w:tcPr>
+          <w:p>
+            <w:pPr>
+              <w:jc w:val="left"/>
+            </w:pPr>
+            <w:r>
+              <w:rPr>
+                <w:rFonts w:ascii="Times New Roman" w:cs="Times New Roman" w:eastAsia="Times New Roman" w:hAnsi="Times New Roman"/>
+                <w:b/>
+                <w:bCs/>
+                <w:sz w:val="18"/>
+                <w:szCs w:val="18"/>
+              </w:rPr>
+              <w:t xml:space="preserve">Neither stage can refuse</w:t>
             </w:r>
           </w:p>
         </w:tc>
@@ -4123,6 +4963,99 @@
     </w:p>
     <w:p>
       <w:pPr>
+        <w:pStyle w:val="Heading2"/>
+        <w:spacing w:after="120" w:before="240"/>
+      </w:pPr>
+      <w:r>
+        <w:rPr>
+          <w:rFonts w:ascii="Times New Roman" w:cs="Times New Roman" w:eastAsia="Times New Roman" w:hAnsi="Times New Roman"/>
+          <w:b/>
+          <w:bCs/>
+          <w:sz w:val="24"/>
+          <w:szCs w:val="24"/>
+        </w:rPr>
+        <w:t xml:space="preserve">4.5 Threshold Sensitivity</w:t>
+      </w:r>
+    </w:p>
+    <w:p>
+      <w:pPr>
+        <w:spacing w:after="120" w:before="0" w:line="276"/>
+        <w:jc w:val="both"/>
+      </w:pPr>
+      <w:r>
+        <w:rPr>
+          <w:rFonts w:ascii="Times New Roman" w:cs="Times New Roman" w:eastAsia="Times New Roman" w:hAnsi="Times New Roman"/>
+          <w:sz w:val="22"/>
+          <w:szCs w:val="22"/>
+        </w:rPr>
+        <w:t xml:space="preserve">The threshold selection depends on how much accuracy one is willing to trade for cost savings. We parameterise this trade-off as max expected_accuracy − α · LLM_call_rate and sweep α on the validation grid (42 configurations × 9 α values). At α=0 (accuracy-first), the optimal config uses 41% LLM calls at 90.9% expected accuracy; at α=0.5 (maximum savings), only 12% of queries reach the LLM at 87.2% accuracy. Our paper config (kt=0.5, et=0.10) was selected by a constraint-based criterion (min LLM rate s.t. acc ≥ 88%), falling between the α=0.10 and α=0.15 operating points. The cascade offers a smooth accuracy–cost dial: practitioners can choose their operating point by adjusting α or their accuracy floor.</w:t>
+      </w:r>
+    </w:p>
+    <w:p>
+      <w:pPr>
+        <w:spacing w:after="80" w:before="200"/>
+        <w:jc w:val="center"/>
+      </w:pPr>
+      <w:r>
+        <w:drawing>
+          <wp:inline distT="0" distB="0" distL="0" distR="0">
+            <wp:extent cx="4953000" cy="3619500"/>
+            <wp:effectExtent t="0" r="0" b="0" l="0"/>
+            <wp:docPr id="1" name="F5_pareto_sensitivity.png" descr="Figure 5. Threshold sensitivity to cost penalty α. Each point is the optimal (kt, et) for a given α, evaluated on the validation set (n=3,100). The paper config (★) uses a constraint-based selection. As α increases, the cascade aggressively reduces LLM calls." title="F5_pareto_sensitivity.png"/>
+            <wp:cNvGraphicFramePr>
+              <a:graphicFrameLocks xmlns:a="http://schemas.openxmlformats.org/drawingml/2006/main" noChangeAspect="1"/>
+            </wp:cNvGraphicFramePr>
+            <a:graphic xmlns:a="http://schemas.openxmlformats.org/drawingml/2006/main">
+              <a:graphicData uri="http://schemas.openxmlformats.org/drawingml/2006/picture">
+                <pic:pic xmlns:pic="http://schemas.openxmlformats.org/drawingml/2006/picture">
+                  <pic:nvPicPr>
+                    <pic:cNvPr id="0" name="" descr=""/>
+                    <pic:cNvPicPr>
+                      <a:picLocks noChangeAspect="1" noChangeArrowheads="1"/>
+                    </pic:cNvPicPr>
+                  </pic:nvPicPr>
+                  <pic:blipFill>
+                    <a:blip r:embed="rId13" cstate="none"/>
+                    <a:srcRect/>
+                    <a:stretch>
+                      <a:fillRect/>
+                    </a:stretch>
+                  </pic:blipFill>
+                  <pic:spPr bwMode="auto">
+                    <a:xfrm>
+                      <a:off x="0" y="0"/>
+                      <a:ext cx="4953000" cy="3619500"/>
+                    </a:xfrm>
+                    <a:prstGeom prst="rect">
+                      <a:avLst/>
+                    </a:prstGeom>
+                  </pic:spPr>
+                </pic:pic>
+              </a:graphicData>
+            </a:graphic>
+          </wp:inline>
+        </w:drawing>
+      </w:r>
+    </w:p>
+    <w:p>
+      <w:pPr>
+        <w:spacing w:after="200" w:before="0" w:line="276"/>
+        <w:jc w:val="center"/>
+      </w:pPr>
+      <w:r>
+        <w:rPr>
+          <w:rFonts w:ascii="Times New Roman" w:cs="Times New Roman" w:eastAsia="Times New Roman" w:hAnsi="Times New Roman"/>
+          <w:i/>
+          <w:iCs/>
+          <w:color w:val="666666"/>
+          <w:sz w:val="20"/>
+          <w:szCs w:val="20"/>
+        </w:rPr>
+        <w:t xml:space="preserve">Figure 5. Threshold sensitivity to cost penalty α. Each point is the optimal (kt, et) for a given α, evaluated on the validation set (n=3,100). The paper config (★) uses a constraint-based selection. As α increases, the cascade aggressively reduces LLM calls.</w:t>
+      </w:r>
+    </w:p>
+    <w:p>
+      <w:pPr>
         <w:pStyle w:val="Heading1"/>
         <w:spacing w:after="120" w:before="360"/>
       </w:pPr>
@@ -4200,7 +5133,7 @@
           <w:sz w:val="22"/>
           <w:szCs w:val="22"/>
         </w:rPr>
-        <w:t xml:space="preserve"> If the cheap router’s confidence calibration is poor, the cascade loses accuracy without saving cost. The R1 false-confidence zone illustrated in the qualitative analysis (polysemous tokens) is the primary failure mode on CLINC150. Our objective function accuracy − 0.1 · LLM_call_rate penalises this miscalibration. In production, the 0.1 coefficient should be replaced with the real LLM cost per query normalised by the product’s accuracy tolerance.</w:t>
+        <w:t xml:space="preserve"> If the cheap router’s confidence calibration is poor, the cascade loses accuracy without saving cost. The R1 false-confidence zone illustrated in the qualitative analysis (polysemous tokens) is the primary failure mode on CLINC150. The α-sensitivity analysis in §4.5 shows how the accuracy–cost trade-off shifts as the cost penalty changes: practitioners should tune α (or equivalently, their accuracy floor) to their deployment’s tolerance.</w:t>
       </w:r>
     </w:p>
     <w:p>
@@ -4216,6 +5149,30 @@
           <w:sz w:val="22"/>
           <w:szCs w:val="22"/>
         </w:rPr>
+        <w:t xml:space="preserve">Latency.</w:t>
+      </w:r>
+      <w:r>
+        <w:rPr>
+          <w:rFonts w:ascii="Times New Roman" w:cs="Times New Roman" w:eastAsia="Times New Roman" w:hAnsi="Times New Roman"/>
+          <w:sz w:val="22"/>
+          <w:szCs w:val="22"/>
+        </w:rPr>
+        <w:t xml:space="preserve"> Beyond cost, the cascade reduces latency. On a Mac Mini (M2), R1 keyword processes a query in 3.2ms median and R2 embedding in 0.3ms — both 100–1,500× faster than R3’s ~500ms API round-trip. Since 74% of queries never reach the LLM, the cascade’s median end-to-end latency is dominated by the cheap stages, not the API call.</w:t>
+      </w:r>
+    </w:p>
+    <w:p>
+      <w:pPr>
+        <w:spacing w:after="120" w:before="0" w:line="276"/>
+        <w:jc w:val="both"/>
+      </w:pPr>
+      <w:r>
+        <w:rPr>
+          <w:rFonts w:ascii="Times New Roman" w:cs="Times New Roman" w:eastAsia="Times New Roman" w:hAnsi="Times New Roman"/>
+          <w:b/>
+          <w:bCs/>
+          <w:sz w:val="22"/>
+          <w:szCs w:val="22"/>
+        </w:rPr>
         <w:t xml:space="preserve">Limitations.</w:t>
       </w:r>
       <w:r>
@@ -4224,7 +5181,7 @@
           <w:sz w:val="22"/>
           <w:szCs w:val="22"/>
         </w:rPr>
-        <w:t xml:space="preserve"> (1) We evaluate on a single benchmark (CLINC150); generalisation to other intent-classification distributions is untested. (2) The 8-way agent inventory is fixed; cascades on much larger label spaces (50+ agents) would require a different cheap-stage design. (3) The thresholds are static — no online adaptation. (4) Haiku 4.5 is itself a cheap model; savings against Claude Sonnet or GPT-4 would be larger in absolute dollars. (5) We measure cost in API dollars, not user-perceived latency.</w:t>
+        <w:t xml:space="preserve"> (1) We evaluate on a single benchmark (CLINC150); generalisation to other intent-classification distributions is untested. (2) The 8-way agent inventory is fixed; cascades on much larger label spaces (50+ agents) would require a different cheap-stage design. (3) The thresholds are static — no online adaptation. (4) Haiku 4.5 is itself a cheap model; savings against Claude Sonnet or GPT-4 would be larger in absolute dollars.</w:t>
       </w:r>
     </w:p>
     <w:p>
@@ -4380,7 +5337,7 @@
           <w:sz w:val="22"/>
           <w:szCs w:val="22"/>
         </w:rPr>
-        <w:t xml:space="preserve">.</w:t>
+        <w:t xml:space="preserve">. We verified reproducibility by running the full 3-seed experiment twice; per-seed accuracy varied by ≤ 0.5pp (1–2 queries out of 400), attributable to rate-limited API retries, with all qualitative conclusions unchanged.</w:t>
       </w:r>
     </w:p>
     <w:p>

</xml_diff>